<commit_message>
Update from zero to complete 10102026
</commit_message>
<xml_diff>
--- a/document/coding_info.docx
+++ b/document/coding_info.docx
@@ -1,6 +1,6 @@
 
 <file path=word/document.xml><?xml version="1.0" encoding="utf-8"?>
-<w:document xmlns:wpc="http://schemas.microsoft.com/office/word/2010/wordprocessingCanvas" xmlns:cx="http://schemas.microsoft.com/office/drawing/2014/chartex" xmlns:cx1="http://schemas.microsoft.com/office/drawing/2015/9/8/chartex" xmlns:cx2="http://schemas.microsoft.com/office/drawing/2015/10/21/chartex" xmlns:cx3="http://schemas.microsoft.com/office/drawing/2016/5/9/chartex" xmlns:cx4="http://schemas.microsoft.com/office/drawing/2016/5/10/chartex" xmlns:cx5="http://schemas.microsoft.com/office/drawing/2016/5/11/chartex" xmlns:cx6="http://schemas.microsoft.com/office/drawing/2016/5/12/chartex" xmlns:cx7="http://schemas.microsoft.com/office/drawing/2016/5/13/chartex" xmlns:cx8="http://schemas.microsoft.com/office/drawing/2016/5/14/chartex" xmlns:mc="http://schemas.openxmlformats.org/markup-compatibility/2006" xmlns:aink="http://schemas.microsoft.com/office/drawing/2016/ink" xmlns:am3d="http://schemas.microsoft.com/office/drawing/2017/model3d" xmlns:o="urn:schemas-microsoft-com:office:office" xmlns:oel="http://schemas.microsoft.com/office/2019/extlst" xmlns:r="http://schemas.openxmlformats.org/officeDocument/2006/relationships" xmlns:m="http://schemas.openxmlformats.org/officeDocument/2006/math" xmlns:v="urn:schemas-microsoft-com:vml" xmlns:wp14="http://schemas.microsoft.com/office/word/2010/wordprocessingDrawing" xmlns:wp="http://schemas.openxmlformats.org/drawingml/2006/wordprocessingDrawing" xmlns:w10="urn:schemas-microsoft-com:office:word" xmlns:w="http://schemas.openxmlformats.org/wordprocessingml/2006/main" xmlns:w14="http://schemas.microsoft.com/office/word/2010/wordml" xmlns:w15="http://schemas.microsoft.com/office/word/2012/wordml" xmlns:w16cei="http://schemas.microsoft.com/office/word/2026/wordml/cei" xmlns:w16cex="http://schemas.microsoft.com/office/word/2018/wordml/cex" xmlns:w16cid="http://schemas.microsoft.com/office/word/2016/wordml/cid" xmlns:w16="http://schemas.microsoft.com/office/word/2018/wordml" xmlns:w16du="http://schemas.microsoft.com/office/word/2023/wordml/word16du" xmlns:w16sdtdh="http://schemas.microsoft.com/office/word/2020/wordml/sdtdatahash" xmlns:w16sdtfl="http://schemas.microsoft.com/office/word/2024/wordml/sdtformatlock" xmlns:w16se="http://schemas.microsoft.com/office/word/2015/wordml/symex" xmlns:wpg="http://schemas.microsoft.com/office/word/2010/wordprocessingGroup" xmlns:wpi="http://schemas.microsoft.com/office/word/2010/wordprocessingInk" xmlns:wne="http://schemas.microsoft.com/office/word/2006/wordml" xmlns:wps="http://schemas.microsoft.com/office/word/2010/wordprocessingShape" mc:Ignorable="w14 w15 w16se w16cid w16 w16cex w16sdtdh w16sdtfl w16du wp14">
+<w:document xmlns:wpc="http://schemas.microsoft.com/office/word/2010/wordprocessingCanvas" xmlns:cx="http://schemas.microsoft.com/office/drawing/2014/chartex" xmlns:cx1="http://schemas.microsoft.com/office/drawing/2015/9/8/chartex" xmlns:cx2="http://schemas.microsoft.com/office/drawing/2015/10/21/chartex" xmlns:cx3="http://schemas.microsoft.com/office/drawing/2016/5/9/chartex" xmlns:cx4="http://schemas.microsoft.com/office/drawing/2016/5/10/chartex" xmlns:cx5="http://schemas.microsoft.com/office/drawing/2016/5/11/chartex" xmlns:cx6="http://schemas.microsoft.com/office/drawing/2016/5/12/chartex" xmlns:cx7="http://schemas.microsoft.com/office/drawing/2016/5/13/chartex" xmlns:cx8="http://schemas.microsoft.com/office/drawing/2016/5/14/chartex" xmlns:mc="http://schemas.openxmlformats.org/markup-compatibility/2006" xmlns:aink="http://schemas.microsoft.com/office/drawing/2016/ink" xmlns:am3d="http://schemas.microsoft.com/office/drawing/2017/model3d" xmlns:o="urn:schemas-microsoft-com:office:office" xmlns:oel="http://schemas.microsoft.com/office/2019/extlst" xmlns:r="http://schemas.openxmlformats.org/officeDocument/2006/relationships" xmlns:m="http://schemas.openxmlformats.org/officeDocument/2006/math" xmlns:v="urn:schemas-microsoft-com:vml" xmlns:wp14="http://schemas.microsoft.com/office/word/2010/wordprocessingDrawing" xmlns:wp="http://schemas.openxmlformats.org/drawingml/2006/wordprocessingDrawing" xmlns:w10="urn:schemas-microsoft-com:office:word" xmlns:w="http://schemas.openxmlformats.org/wordprocessingml/2006/main" xmlns:w14="http://schemas.microsoft.com/office/word/2010/wordml" xmlns:w15="http://schemas.microsoft.com/office/word/2012/wordml" xmlns:w16cex="http://schemas.microsoft.com/office/word/2018/wordml/cex" xmlns:w16cid="http://schemas.microsoft.com/office/word/2016/wordml/cid" xmlns:w16="http://schemas.microsoft.com/office/word/2018/wordml" xmlns:w16du="http://schemas.microsoft.com/office/word/2023/wordml/word16du" xmlns:w16sdtdh="http://schemas.microsoft.com/office/word/2020/wordml/sdtdatahash" xmlns:w16sdtfl="http://schemas.microsoft.com/office/word/2024/wordml/sdtformatlock" xmlns:w16se="http://schemas.microsoft.com/office/word/2015/wordml/symex" xmlns:wpg="http://schemas.microsoft.com/office/word/2010/wordprocessingGroup" xmlns:wpi="http://schemas.microsoft.com/office/word/2010/wordprocessingInk" xmlns:wne="http://schemas.microsoft.com/office/word/2006/wordml" xmlns:wps="http://schemas.microsoft.com/office/word/2010/wordprocessingShape" mc:Ignorable="w14 w15 w16se w16cid w16 w16cex w16sdtdh w16sdtfl w16du wp14">
   <w:body>
     <w:p>
       <w:r>
@@ -11,13 +11,16 @@
         <w:t>Title:</w:t>
       </w:r>
       <w:r>
-        <w:t xml:space="preserve"> Coding Information &amp; Standards – </w:t>
+        <w:t xml:space="preserve"> Coding Information &amp; Standards — Personal-</w:t>
       </w:r>
       <w:proofErr w:type="spellStart"/>
       <w:r>
-        <w:t>myFirst_web</w:t>
+        <w:t>Portfalio</w:t>
       </w:r>
       <w:proofErr w:type="spellEnd"/>
+      <w:r>
+        <w:t>-Website</w:t>
+      </w:r>
     </w:p>
     <w:p>
       <w:r>
@@ -32,7 +35,7 @@
       <w:pPr>
         <w:numPr>
           <w:ilvl w:val="0"/>
-          <w:numId w:val="4"/>
+          <w:numId w:val="8"/>
         </w:numPr>
       </w:pPr>
       <w:r>
@@ -43,14 +46,14 @@
         <w:t>HTML5:</w:t>
       </w:r>
       <w:r>
-        <w:t> Semantic tags (&lt;header&gt;, &lt;nav&gt;, &lt;section&gt;, &lt;footer&gt;, &lt;article&gt;) for better SEO and accessibility.</w:t>
+        <w:t xml:space="preserve"> Semantic tags (&lt;header&gt;, &lt;nav&gt;, &lt;main&gt;, &lt;section&gt;, &lt;footer&gt;, &lt;article&gt;) for better SEO and accessibility.</w:t>
       </w:r>
     </w:p>
     <w:p>
       <w:pPr>
         <w:numPr>
           <w:ilvl w:val="0"/>
-          <w:numId w:val="4"/>
+          <w:numId w:val="8"/>
         </w:numPr>
       </w:pPr>
       <w:r>
@@ -61,22 +64,22 @@
         <w:t>CSS3:</w:t>
       </w:r>
       <w:r>
-        <w:t> Custom properties (--primary-</w:t>
+        <w:t xml:space="preserve"> Custom properties (--accent, --</w:t>
       </w:r>
       <w:proofErr w:type="spellStart"/>
       <w:r>
-        <w:t>color</w:t>
+        <w:t>bg</w:t>
       </w:r>
       <w:proofErr w:type="spellEnd"/>
       <w:r>
-        <w:t>), CSS Grid, Flexbox, and @media queries for responsiveness.</w:t>
+        <w:t>), CSS Grid, Flexbox, and @media queries for responsiveness.</w:t>
       </w:r>
     </w:p>
     <w:p>
       <w:pPr>
         <w:numPr>
           <w:ilvl w:val="0"/>
-          <w:numId w:val="4"/>
+          <w:numId w:val="8"/>
         </w:numPr>
       </w:pPr>
       <w:r>
@@ -87,7 +90,7 @@
         <w:t>JavaScript (ES6+):</w:t>
       </w:r>
       <w:r>
-        <w:t> Strict mode, arrow functions, </w:t>
+        <w:t xml:space="preserve"> Strict mode, arrow functions, </w:t>
       </w:r>
       <w:proofErr w:type="spellStart"/>
       <w:r>
@@ -111,7 +114,7 @@
       <w:pPr>
         <w:numPr>
           <w:ilvl w:val="0"/>
-          <w:numId w:val="5"/>
+          <w:numId w:val="9"/>
         </w:numPr>
       </w:pPr>
       <w:r>
@@ -122,30 +125,14 @@
         <w:t>CSS Naming:</w:t>
       </w:r>
       <w:r>
-        <w:t> kebab-case (e.g.</w:t>
-      </w:r>
-      <w:proofErr w:type="gramStart"/>
-      <w:r>
-        <w:t>, .hero</w:t>
-      </w:r>
-      <w:proofErr w:type="gramEnd"/>
-      <w:r>
-        <w:t>-content</w:t>
-      </w:r>
-      <w:proofErr w:type="gramStart"/>
-      <w:r>
-        <w:t>, .skill</w:t>
-      </w:r>
-      <w:proofErr w:type="gramEnd"/>
-      <w:r>
-        <w:t>-card).</w:t>
+        <w:t xml:space="preserve"> kebab-case (e.g., .hero-content, .skill-card, .quick-link).</w:t>
       </w:r>
     </w:p>
     <w:p>
       <w:pPr>
         <w:numPr>
           <w:ilvl w:val="0"/>
-          <w:numId w:val="5"/>
+          <w:numId w:val="9"/>
         </w:numPr>
       </w:pPr>
       <w:r>
@@ -156,19 +143,19 @@
         <w:t>JS Naming:</w:t>
       </w:r>
       <w:r>
-        <w:t> camelCase (e.g., </w:t>
+        <w:t xml:space="preserve"> camelCase (e.g., </w:t>
       </w:r>
       <w:proofErr w:type="spellStart"/>
       <w:r>
-        <w:t>loginBtn</w:t>
+        <w:t>layoutBtn</w:t>
       </w:r>
       <w:proofErr w:type="spellEnd"/>
       <w:r>
-        <w:t>, </w:t>
+        <w:t xml:space="preserve">, </w:t>
       </w:r>
       <w:proofErr w:type="spellStart"/>
       <w:r>
-        <w:t>closeModal</w:t>
+        <w:t>applyTheme</w:t>
       </w:r>
       <w:proofErr w:type="spellEnd"/>
       <w:r>
@@ -179,7 +166,7 @@
       <w:pPr>
         <w:numPr>
           <w:ilvl w:val="0"/>
-          <w:numId w:val="5"/>
+          <w:numId w:val="9"/>
         </w:numPr>
       </w:pPr>
       <w:r>
@@ -190,14 +177,14 @@
         <w:t>Indentation:</w:t>
       </w:r>
       <w:r>
-        <w:t> 4 spaces for all files.</w:t>
+        <w:t xml:space="preserve"> 2 spaces for all files.</w:t>
       </w:r>
     </w:p>
     <w:p>
       <w:pPr>
         <w:numPr>
           <w:ilvl w:val="0"/>
-          <w:numId w:val="5"/>
+          <w:numId w:val="9"/>
         </w:numPr>
       </w:pPr>
       <w:r>
@@ -208,14 +195,14 @@
         <w:t>Comments:</w:t>
       </w:r>
       <w:r>
-        <w:t> Inline comments are used in JavaScript to explain event listeners and logic.</w:t>
+        <w:t xml:space="preserve"> Inline comments are used in JavaScript to explain event listeners and logic.</w:t>
       </w:r>
     </w:p>
     <w:p>
       <w:pPr>
         <w:numPr>
           <w:ilvl w:val="0"/>
-          <w:numId w:val="5"/>
+          <w:numId w:val="9"/>
         </w:numPr>
       </w:pPr>
       <w:r>
@@ -230,11 +217,11 @@
       <w:pPr>
         <w:numPr>
           <w:ilvl w:val="1"/>
-          <w:numId w:val="5"/>
+          <w:numId w:val="9"/>
         </w:numPr>
       </w:pPr>
       <w:r>
-        <w:t>Root: Contains all runnable code (.html, .</w:t>
+        <w:t>Root: Contains all runnable code (.html, .</w:t>
       </w:r>
       <w:proofErr w:type="spellStart"/>
       <w:r>
@@ -242,7 +229,7 @@
       </w:r>
       <w:proofErr w:type="spellEnd"/>
       <w:r>
-        <w:t>, .</w:t>
+        <w:t>, .</w:t>
       </w:r>
       <w:proofErr w:type="spellStart"/>
       <w:r>
@@ -250,26 +237,18 @@
       </w:r>
       <w:proofErr w:type="spellEnd"/>
       <w:r>
-        <w:t>) and README.md.</w:t>
+        <w:t>), resume PDF, and README.md.</w:t>
       </w:r>
     </w:p>
     <w:p>
       <w:pPr>
         <w:numPr>
           <w:ilvl w:val="1"/>
-          <w:numId w:val="5"/>
+          <w:numId w:val="9"/>
         </w:numPr>
       </w:pPr>
       <w:r>
-        <w:t>/</w:t>
-      </w:r>
-      <w:proofErr w:type="gramStart"/>
-      <w:r>
-        <w:t>document</w:t>
-      </w:r>
-      <w:proofErr w:type="gramEnd"/>
-      <w:r>
-        <w:t>: Contains all SDLC planning and archive files (.docx).</w:t>
+        <w:t>/document: Contains all SDLC planning and archive files (.docx).</w:t>
       </w:r>
     </w:p>
     <w:p>
@@ -278,14 +257,87 @@
           <w:b/>
           <w:bCs/>
         </w:rPr>
-        <w:t>3. Version Control (Git)</w:t>
+        <w:t>3. Development Approach</w:t>
       </w:r>
     </w:p>
     <w:p>
       <w:pPr>
         <w:numPr>
           <w:ilvl w:val="0"/>
-          <w:numId w:val="6"/>
+          <w:numId w:val="10"/>
+        </w:numPr>
+      </w:pPr>
+      <w:r>
+        <w:rPr>
+          <w:b/>
+          <w:bCs/>
+        </w:rPr>
+        <w:t>AI-Assisted Coding:</w:t>
+      </w:r>
+      <w:r>
+        <w:t xml:space="preserve"> </w:t>
+      </w:r>
+      <w:r>
+        <w:rPr>
+          <w:b/>
+          <w:bCs/>
+        </w:rPr>
+        <w:t>DeepSeek</w:t>
+      </w:r>
+      <w:r>
+        <w:t xml:space="preserve"> was used as the primary AI coding assistant for generating HTML structure, CSS styling, and JavaScript logic. All output was reviewed, tested, and adjusted manually before committing.</w:t>
+      </w:r>
+    </w:p>
+    <w:p>
+      <w:pPr>
+        <w:numPr>
+          <w:ilvl w:val="0"/>
+          <w:numId w:val="10"/>
+        </w:numPr>
+      </w:pPr>
+      <w:r>
+        <w:rPr>
+          <w:b/>
+          <w:bCs/>
+        </w:rPr>
+        <w:t>Manual Review:</w:t>
+      </w:r>
+      <w:r>
+        <w:t xml:space="preserve"> Every block of AI-generated code was checked for correctness, accessibility, and consistency with the project standards before being included.</w:t>
+      </w:r>
+    </w:p>
+    <w:p>
+      <w:pPr>
+        <w:numPr>
+          <w:ilvl w:val="0"/>
+          <w:numId w:val="10"/>
+        </w:numPr>
+      </w:pPr>
+      <w:r>
+        <w:rPr>
+          <w:b/>
+          <w:bCs/>
+        </w:rPr>
+        <w:t>Iterative Refinement:</w:t>
+      </w:r>
+      <w:r>
+        <w:t xml:space="preserve"> Code was refined across multiple sessions to match the resume content, layout goals, and responsive requirements.</w:t>
+      </w:r>
+    </w:p>
+    <w:p>
+      <w:r>
+        <w:rPr>
+          <w:b/>
+          <w:bCs/>
+        </w:rPr>
+        <w:t>4. Version Control (Git)</w:t>
+      </w:r>
+    </w:p>
+    <w:p>
+      <w:pPr>
+        <w:numPr>
+          <w:ilvl w:val="0"/>
+          <w:numId w:val="11"/>
         </w:numPr>
       </w:pPr>
       <w:r>
@@ -296,22 +348,22 @@
         <w:t>Remote:</w:t>
       </w:r>
       <w:r>
-        <w:t> GitHub (aniruddhbhate1901/</w:t>
+        <w:t xml:space="preserve"> GitHub — aniruddhrao1901/Personal-</w:t>
       </w:r>
       <w:proofErr w:type="spellStart"/>
       <w:r>
-        <w:t>myFirst_web</w:t>
+        <w:t>Portfalio</w:t>
       </w:r>
       <w:proofErr w:type="spellEnd"/>
       <w:r>
-        <w:t>).</w:t>
+        <w:t>-Website</w:t>
       </w:r>
     </w:p>
     <w:p>
       <w:pPr>
         <w:numPr>
           <w:ilvl w:val="0"/>
-          <w:numId w:val="6"/>
+          <w:numId w:val="11"/>
         </w:numPr>
       </w:pPr>
       <w:r>
@@ -322,14 +374,14 @@
         <w:t>Branch Strategy:</w:t>
       </w:r>
       <w:r>
-        <w:t> main is the default and production branch. All changes are committed directly to main for simplicity (as this is a solo project).</w:t>
+        <w:t xml:space="preserve"> main is the default and production branch. All changes are committed directly to main for simplicity (as this is a solo project).</w:t>
       </w:r>
     </w:p>
     <w:p>
       <w:pPr>
         <w:numPr>
           <w:ilvl w:val="0"/>
-          <w:numId w:val="6"/>
+          <w:numId w:val="11"/>
         </w:numPr>
       </w:pPr>
       <w:r>
@@ -340,31 +392,7 @@
         <w:t>Commit Convention:</w:t>
       </w:r>
       <w:r>
-        <w:t> Semantic messages are used (e.g., </w:t>
-      </w:r>
-      <w:proofErr w:type="gramStart"/>
-      <w:r>
-        <w:t>feat:,</w:t>
-      </w:r>
-      <w:proofErr w:type="gramEnd"/>
-      <w:r>
-        <w:t> </w:t>
-      </w:r>
-      <w:proofErr w:type="gramStart"/>
-      <w:r>
-        <w:t>fix:,</w:t>
-      </w:r>
-      <w:proofErr w:type="gramEnd"/>
-      <w:r>
-        <w:t> </w:t>
-      </w:r>
-      <w:proofErr w:type="gramStart"/>
-      <w:r>
-        <w:t>docs:,</w:t>
-      </w:r>
-      <w:proofErr w:type="gramEnd"/>
-      <w:r>
-        <w:t> style:).</w:t>
+        <w:t xml:space="preserve"> Semantic messages are used (e.g., feat:, fix:, docs:, style:).</w:t>
       </w:r>
     </w:p>
     <w:p>
@@ -373,14 +401,14 @@
           <w:b/>
           <w:bCs/>
         </w:rPr>
-        <w:t>4. Build &amp; Deployment</w:t>
+        <w:t>5. Build &amp; Deployment</w:t>
       </w:r>
     </w:p>
     <w:p>
       <w:pPr>
         <w:numPr>
           <w:ilvl w:val="0"/>
-          <w:numId w:val="7"/>
+          <w:numId w:val="12"/>
         </w:numPr>
       </w:pPr>
       <w:r>
@@ -388,17 +416,18 @@
           <w:b/>
           <w:bCs/>
         </w:rPr>
+        <w:lastRenderedPageBreak/>
         <w:t>Build Tool:</w:t>
       </w:r>
       <w:r>
-        <w:t> None (Static HTML).</w:t>
+        <w:t xml:space="preserve"> None (Static HTML).</w:t>
       </w:r>
     </w:p>
     <w:p>
       <w:pPr>
         <w:numPr>
           <w:ilvl w:val="0"/>
-          <w:numId w:val="7"/>
+          <w:numId w:val="12"/>
         </w:numPr>
       </w:pPr>
       <w:r>
@@ -409,7 +438,7 @@
         <w:t>Deployment Target:</w:t>
       </w:r>
       <w:r>
-        <w:t> </w:t>
+        <w:t xml:space="preserve"> </w:t>
       </w:r>
       <w:proofErr w:type="spellStart"/>
       <w:r>
@@ -424,7 +453,7 @@
       <w:pPr>
         <w:numPr>
           <w:ilvl w:val="0"/>
-          <w:numId w:val="7"/>
+          <w:numId w:val="12"/>
         </w:numPr>
       </w:pPr>
       <w:r>
@@ -435,11 +464,407 @@
         <w:t>Node.js:</w:t>
       </w:r>
       <w:r>
-        <w:t> Not required for this front-end project.</w:t>
+        <w:t xml:space="preserve"> Not required for this front-end project.</w:t>
+      </w:r>
+    </w:p>
+    <w:p>
+      <w:r>
+        <w:rPr>
+          <w:b/>
+          <w:bCs/>
+        </w:rPr>
+        <w:t>6. File Summary</w:t>
+      </w:r>
+    </w:p>
+    <w:tbl>
+      <w:tblPr>
+        <w:tblW w:w="11280" w:type="dxa"/>
+        <w:tblCellMar>
+          <w:top w:w="15" w:type="dxa"/>
+          <w:left w:w="15" w:type="dxa"/>
+          <w:bottom w:w="15" w:type="dxa"/>
+          <w:right w:w="15" w:type="dxa"/>
+        </w:tblCellMar>
+        <w:tblLook w:val="04A0" w:firstRow="1" w:lastRow="0" w:firstColumn="1" w:lastColumn="0" w:noHBand="0" w:noVBand="1"/>
+      </w:tblPr>
+      <w:tblGrid>
+        <w:gridCol w:w="4374"/>
+        <w:gridCol w:w="1728"/>
+        <w:gridCol w:w="5178"/>
+      </w:tblGrid>
+      <w:tr>
+        <w:trPr>
+          <w:tblHeader/>
+        </w:trPr>
+        <w:tc>
+          <w:tcPr>
+            <w:tcW w:w="0" w:type="auto"/>
+            <w:tcBorders>
+              <w:top w:val="nil"/>
+            </w:tcBorders>
+            <w:tcMar>
+              <w:top w:w="150" w:type="dxa"/>
+              <w:left w:w="0" w:type="dxa"/>
+              <w:bottom w:w="150" w:type="dxa"/>
+              <w:right w:w="240" w:type="dxa"/>
+            </w:tcMar>
+            <w:vAlign w:val="center"/>
+            <w:hideMark/>
+          </w:tcPr>
+          <w:p>
+            <w:r>
+              <w:t>File</w:t>
+            </w:r>
+          </w:p>
+        </w:tc>
+        <w:tc>
+          <w:tcPr>
+            <w:tcW w:w="0" w:type="auto"/>
+            <w:tcBorders>
+              <w:top w:val="nil"/>
+            </w:tcBorders>
+            <w:tcMar>
+              <w:top w:w="150" w:type="dxa"/>
+              <w:left w:w="240" w:type="dxa"/>
+              <w:bottom w:w="150" w:type="dxa"/>
+              <w:right w:w="240" w:type="dxa"/>
+            </w:tcMar>
+            <w:vAlign w:val="center"/>
+            <w:hideMark/>
+          </w:tcPr>
+          <w:p>
+            <w:r>
+              <w:t>Language</w:t>
+            </w:r>
+          </w:p>
+        </w:tc>
+        <w:tc>
+          <w:tcPr>
+            <w:tcW w:w="0" w:type="auto"/>
+            <w:tcBorders>
+              <w:top w:val="nil"/>
+            </w:tcBorders>
+            <w:tcMar>
+              <w:top w:w="150" w:type="dxa"/>
+              <w:left w:w="240" w:type="dxa"/>
+              <w:bottom w:w="150" w:type="dxa"/>
+              <w:right w:w="240" w:type="dxa"/>
+            </w:tcMar>
+            <w:vAlign w:val="center"/>
+            <w:hideMark/>
+          </w:tcPr>
+          <w:p>
+            <w:r>
+              <w:t>Purpose</w:t>
+            </w:r>
+          </w:p>
+        </w:tc>
+      </w:tr>
+      <w:tr>
+        <w:tc>
+          <w:tcPr>
+            <w:tcW w:w="0" w:type="auto"/>
+            <w:tcMar>
+              <w:top w:w="150" w:type="dxa"/>
+              <w:left w:w="0" w:type="dxa"/>
+              <w:bottom w:w="150" w:type="dxa"/>
+              <w:right w:w="240" w:type="dxa"/>
+            </w:tcMar>
+            <w:vAlign w:val="center"/>
+            <w:hideMark/>
+          </w:tcPr>
+          <w:p>
+            <w:r>
+              <w:t>index.html</w:t>
+            </w:r>
+          </w:p>
+        </w:tc>
+        <w:tc>
+          <w:tcPr>
+            <w:tcW w:w="0" w:type="auto"/>
+            <w:tcMar>
+              <w:top w:w="150" w:type="dxa"/>
+              <w:left w:w="240" w:type="dxa"/>
+              <w:bottom w:w="150" w:type="dxa"/>
+              <w:right w:w="240" w:type="dxa"/>
+            </w:tcMar>
+            <w:vAlign w:val="center"/>
+            <w:hideMark/>
+          </w:tcPr>
+          <w:p>
+            <w:r>
+              <w:t>HTML5</w:t>
+            </w:r>
+          </w:p>
+        </w:tc>
+        <w:tc>
+          <w:tcPr>
+            <w:tcW w:w="0" w:type="auto"/>
+            <w:tcMar>
+              <w:top w:w="150" w:type="dxa"/>
+              <w:left w:w="240" w:type="dxa"/>
+              <w:bottom w:w="150" w:type="dxa"/>
+              <w:right w:w="0" w:type="dxa"/>
+            </w:tcMar>
+            <w:vAlign w:val="center"/>
+            <w:hideMark/>
+          </w:tcPr>
+          <w:p>
+            <w:r>
+              <w:t>Public page — all sections</w:t>
+            </w:r>
+          </w:p>
+        </w:tc>
+      </w:tr>
+      <w:tr>
+        <w:tc>
+          <w:tcPr>
+            <w:tcW w:w="0" w:type="auto"/>
+            <w:tcMar>
+              <w:top w:w="150" w:type="dxa"/>
+              <w:left w:w="0" w:type="dxa"/>
+              <w:bottom w:w="150" w:type="dxa"/>
+              <w:right w:w="240" w:type="dxa"/>
+            </w:tcMar>
+            <w:vAlign w:val="center"/>
+            <w:hideMark/>
+          </w:tcPr>
+          <w:p>
+            <w:r>
+              <w:t>style.css</w:t>
+            </w:r>
+          </w:p>
+        </w:tc>
+        <w:tc>
+          <w:tcPr>
+            <w:tcW w:w="0" w:type="auto"/>
+            <w:tcMar>
+              <w:top w:w="150" w:type="dxa"/>
+              <w:left w:w="240" w:type="dxa"/>
+              <w:bottom w:w="150" w:type="dxa"/>
+              <w:right w:w="240" w:type="dxa"/>
+            </w:tcMar>
+            <w:vAlign w:val="center"/>
+            <w:hideMark/>
+          </w:tcPr>
+          <w:p>
+            <w:r>
+              <w:t>CSS3</w:t>
+            </w:r>
+          </w:p>
+        </w:tc>
+        <w:tc>
+          <w:tcPr>
+            <w:tcW w:w="0" w:type="auto"/>
+            <w:tcMar>
+              <w:top w:w="150" w:type="dxa"/>
+              <w:left w:w="240" w:type="dxa"/>
+              <w:bottom w:w="150" w:type="dxa"/>
+              <w:right w:w="0" w:type="dxa"/>
+            </w:tcMar>
+            <w:vAlign w:val="center"/>
+            <w:hideMark/>
+          </w:tcPr>
+          <w:p>
+            <w:r>
+              <w:t>Theme, colours, layout, components</w:t>
+            </w:r>
+          </w:p>
+        </w:tc>
+      </w:tr>
+      <w:tr>
+        <w:tc>
+          <w:tcPr>
+            <w:tcW w:w="0" w:type="auto"/>
+            <w:tcMar>
+              <w:top w:w="150" w:type="dxa"/>
+              <w:left w:w="0" w:type="dxa"/>
+              <w:bottom w:w="150" w:type="dxa"/>
+              <w:right w:w="240" w:type="dxa"/>
+            </w:tcMar>
+            <w:vAlign w:val="center"/>
+            <w:hideMark/>
+          </w:tcPr>
+          <w:p>
+            <w:r>
+              <w:t>script.js</w:t>
+            </w:r>
+          </w:p>
+        </w:tc>
+        <w:tc>
+          <w:tcPr>
+            <w:tcW w:w="0" w:type="auto"/>
+            <w:tcMar>
+              <w:top w:w="150" w:type="dxa"/>
+              <w:left w:w="240" w:type="dxa"/>
+              <w:bottom w:w="150" w:type="dxa"/>
+              <w:right w:w="240" w:type="dxa"/>
+            </w:tcMar>
+            <w:vAlign w:val="center"/>
+            <w:hideMark/>
+          </w:tcPr>
+          <w:p>
+            <w:r>
+              <w:t>JavaScript</w:t>
+            </w:r>
+          </w:p>
+        </w:tc>
+        <w:tc>
+          <w:tcPr>
+            <w:tcW w:w="0" w:type="auto"/>
+            <w:tcMar>
+              <w:top w:w="150" w:type="dxa"/>
+              <w:left w:w="240" w:type="dxa"/>
+              <w:bottom w:w="150" w:type="dxa"/>
+              <w:right w:w="0" w:type="dxa"/>
+            </w:tcMar>
+            <w:vAlign w:val="center"/>
+            <w:hideMark/>
+          </w:tcPr>
+          <w:p>
+            <w:r>
+              <w:t>Layout/theme/colour switching, nav, form</w:t>
+            </w:r>
+          </w:p>
+        </w:tc>
+      </w:tr>
+      <w:tr>
+        <w:tc>
+          <w:tcPr>
+            <w:tcW w:w="0" w:type="auto"/>
+            <w:tcMar>
+              <w:top w:w="150" w:type="dxa"/>
+              <w:left w:w="0" w:type="dxa"/>
+              <w:bottom w:w="150" w:type="dxa"/>
+              <w:right w:w="240" w:type="dxa"/>
+            </w:tcMar>
+            <w:vAlign w:val="center"/>
+            <w:hideMark/>
+          </w:tcPr>
+          <w:p>
+            <w:r>
+              <w:t>AniruddhRaoResume09102026.pdf</w:t>
+            </w:r>
+          </w:p>
+        </w:tc>
+        <w:tc>
+          <w:tcPr>
+            <w:tcW w:w="0" w:type="auto"/>
+            <w:tcMar>
+              <w:top w:w="150" w:type="dxa"/>
+              <w:left w:w="240" w:type="dxa"/>
+              <w:bottom w:w="150" w:type="dxa"/>
+              <w:right w:w="240" w:type="dxa"/>
+            </w:tcMar>
+            <w:vAlign w:val="center"/>
+            <w:hideMark/>
+          </w:tcPr>
+          <w:p>
+            <w:r>
+              <w:t>PDF</w:t>
+            </w:r>
+          </w:p>
+        </w:tc>
+        <w:tc>
+          <w:tcPr>
+            <w:tcW w:w="0" w:type="auto"/>
+            <w:tcMar>
+              <w:top w:w="150" w:type="dxa"/>
+              <w:left w:w="240" w:type="dxa"/>
+              <w:bottom w:w="150" w:type="dxa"/>
+              <w:right w:w="0" w:type="dxa"/>
+            </w:tcMar>
+            <w:vAlign w:val="center"/>
+            <w:hideMark/>
+          </w:tcPr>
+          <w:p>
+            <w:r>
+              <w:t>Resume download</w:t>
+            </w:r>
+          </w:p>
+        </w:tc>
+      </w:tr>
+    </w:tbl>
+    <w:p>
+      <w:r>
+        <w:rPr>
+          <w:b/>
+          <w:bCs/>
+        </w:rPr>
+        <w:t>7. Code Quality Notes</w:t>
+      </w:r>
+    </w:p>
+    <w:p>
+      <w:pPr>
+        <w:numPr>
+          <w:ilvl w:val="0"/>
+          <w:numId w:val="13"/>
+        </w:numPr>
+      </w:pPr>
+      <w:r>
+        <w:t>All interactive controls have ARIA labels.</w:t>
+      </w:r>
+    </w:p>
+    <w:p>
+      <w:pPr>
+        <w:numPr>
+          <w:ilvl w:val="0"/>
+          <w:numId w:val="13"/>
+        </w:numPr>
+      </w:pPr>
+      <w:r>
+        <w:t xml:space="preserve">All colour/theme/layout preferences persist via </w:t>
+      </w:r>
+      <w:proofErr w:type="spellStart"/>
+      <w:r>
+        <w:t>localStorage</w:t>
+      </w:r>
+      <w:proofErr w:type="spellEnd"/>
+      <w:r>
+        <w:t>.</w:t>
+      </w:r>
+    </w:p>
+    <w:p>
+      <w:pPr>
+        <w:numPr>
+          <w:ilvl w:val="0"/>
+          <w:numId w:val="13"/>
+        </w:numPr>
+      </w:pPr>
+      <w:r>
+        <w:t>No external libraries used (no jQuery, no framework).</w:t>
+      </w:r>
+    </w:p>
+    <w:p>
+      <w:pPr>
+        <w:numPr>
+          <w:ilvl w:val="0"/>
+          <w:numId w:val="13"/>
+        </w:numPr>
+      </w:pPr>
+      <w:r>
+        <w:t>Fully responsive from mobile (≤480px) to desktop (≥1400px).</w:t>
+      </w:r>
+    </w:p>
+    <w:p>
+      <w:pPr>
+        <w:numPr>
+          <w:ilvl w:val="0"/>
+          <w:numId w:val="13"/>
+        </w:numPr>
+      </w:pPr>
+      <w:r>
+        <w:t>Respects prefers-reduced-motion for accessibility.</w:t>
       </w:r>
     </w:p>
     <w:p/>
     <w:sectPr>
+      <w:headerReference w:type="even" r:id="rId7"/>
+      <w:headerReference w:type="default" r:id="rId8"/>
+      <w:footerReference w:type="even" r:id="rId9"/>
+      <w:footerReference w:type="default" r:id="rId10"/>
+      <w:headerReference w:type="first" r:id="rId11"/>
+      <w:footerReference w:type="first" r:id="rId12"/>
       <w:pgSz w:w="11906" w:h="16838"/>
       <w:pgMar w:top="1440" w:right="1440" w:bottom="1440" w:left="1440" w:header="708" w:footer="708" w:gutter="0"/>
       <w:cols w:space="708"/>
@@ -449,9 +874,314 @@
 </w:document>
 </file>
 
+<file path=word/endnotes.xml><?xml version="1.0" encoding="utf-8"?>
+<w:endnotes xmlns:wpc="http://schemas.microsoft.com/office/word/2010/wordprocessingCanvas" xmlns:cx="http://schemas.microsoft.com/office/drawing/2014/chartex" xmlns:cx1="http://schemas.microsoft.com/office/drawing/2015/9/8/chartex" xmlns:cx2="http://schemas.microsoft.com/office/drawing/2015/10/21/chartex" xmlns:cx3="http://schemas.microsoft.com/office/drawing/2016/5/9/chartex" xmlns:cx4="http://schemas.microsoft.com/office/drawing/2016/5/10/chartex" xmlns:cx5="http://schemas.microsoft.com/office/drawing/2016/5/11/chartex" xmlns:cx6="http://schemas.microsoft.com/office/drawing/2016/5/12/chartex" xmlns:cx7="http://schemas.microsoft.com/office/drawing/2016/5/13/chartex" xmlns:cx8="http://schemas.microsoft.com/office/drawing/2016/5/14/chartex" xmlns:mc="http://schemas.openxmlformats.org/markup-compatibility/2006" xmlns:aink="http://schemas.microsoft.com/office/drawing/2016/ink" xmlns:am3d="http://schemas.microsoft.com/office/drawing/2017/model3d" xmlns:o="urn:schemas-microsoft-com:office:office" xmlns:oel="http://schemas.microsoft.com/office/2019/extlst" xmlns:r="http://schemas.openxmlformats.org/officeDocument/2006/relationships" xmlns:m="http://schemas.openxmlformats.org/officeDocument/2006/math" xmlns:v="urn:schemas-microsoft-com:vml" xmlns:wp14="http://schemas.microsoft.com/office/word/2010/wordprocessingDrawing" xmlns:wp="http://schemas.openxmlformats.org/drawingml/2006/wordprocessingDrawing" xmlns:w10="urn:schemas-microsoft-com:office:word" xmlns:w="http://schemas.openxmlformats.org/wordprocessingml/2006/main" xmlns:w14="http://schemas.microsoft.com/office/word/2010/wordml" xmlns:w15="http://schemas.microsoft.com/office/word/2012/wordml" xmlns:w16cex="http://schemas.microsoft.com/office/word/2018/wordml/cex" xmlns:w16cid="http://schemas.microsoft.com/office/word/2016/wordml/cid" xmlns:w16="http://schemas.microsoft.com/office/word/2018/wordml" xmlns:w16du="http://schemas.microsoft.com/office/word/2023/wordml/word16du" xmlns:w16sdtdh="http://schemas.microsoft.com/office/word/2020/wordml/sdtdatahash" xmlns:w16sdtfl="http://schemas.microsoft.com/office/word/2024/wordml/sdtformatlock" xmlns:w16se="http://schemas.microsoft.com/office/word/2015/wordml/symex" xmlns:wpg="http://schemas.microsoft.com/office/word/2010/wordprocessingGroup" xmlns:wpi="http://schemas.microsoft.com/office/word/2010/wordprocessingInk" xmlns:wne="http://schemas.microsoft.com/office/word/2006/wordml" xmlns:wps="http://schemas.microsoft.com/office/word/2010/wordprocessingShape" mc:Ignorable="w14 w15 w16se w16cid w16 w16cex w16sdtdh w16sdtfl w16du wp14">
+  <w:endnote w:type="separator" w:id="-1">
+    <w:p>
+      <w:pPr>
+        <w:spacing w:after="0" w:line="240" w:lineRule="auto"/>
+      </w:pPr>
+      <w:r>
+        <w:separator/>
+      </w:r>
+    </w:p>
+  </w:endnote>
+  <w:endnote w:type="continuationSeparator" w:id="0">
+    <w:p>
+      <w:pPr>
+        <w:spacing w:after="0" w:line="240" w:lineRule="auto"/>
+      </w:pPr>
+      <w:r>
+        <w:continuationSeparator/>
+      </w:r>
+    </w:p>
+  </w:endnote>
+</w:endnotes>
+</file>
+
+<file path=word/footer1.xml><?xml version="1.0" encoding="utf-8"?>
+<w:ftr xmlns:wpc="http://schemas.microsoft.com/office/word/2010/wordprocessingCanvas" xmlns:cx="http://schemas.microsoft.com/office/drawing/2014/chartex" xmlns:cx1="http://schemas.microsoft.com/office/drawing/2015/9/8/chartex" xmlns:cx2="http://schemas.microsoft.com/office/drawing/2015/10/21/chartex" xmlns:cx3="http://schemas.microsoft.com/office/drawing/2016/5/9/chartex" xmlns:cx4="http://schemas.microsoft.com/office/drawing/2016/5/10/chartex" xmlns:cx5="http://schemas.microsoft.com/office/drawing/2016/5/11/chartex" xmlns:cx6="http://schemas.microsoft.com/office/drawing/2016/5/12/chartex" xmlns:cx7="http://schemas.microsoft.com/office/drawing/2016/5/13/chartex" xmlns:cx8="http://schemas.microsoft.com/office/drawing/2016/5/14/chartex" xmlns:mc="http://schemas.openxmlformats.org/markup-compatibility/2006" xmlns:aink="http://schemas.microsoft.com/office/drawing/2016/ink" xmlns:am3d="http://schemas.microsoft.com/office/drawing/2017/model3d" xmlns:o="urn:schemas-microsoft-com:office:office" xmlns:oel="http://schemas.microsoft.com/office/2019/extlst" xmlns:r="http://schemas.openxmlformats.org/officeDocument/2006/relationships" xmlns:m="http://schemas.openxmlformats.org/officeDocument/2006/math" xmlns:v="urn:schemas-microsoft-com:vml" xmlns:wp14="http://schemas.microsoft.com/office/word/2010/wordprocessingDrawing" xmlns:wp="http://schemas.openxmlformats.org/drawingml/2006/wordprocessingDrawing" xmlns:w10="urn:schemas-microsoft-com:office:word" xmlns:w="http://schemas.openxmlformats.org/wordprocessingml/2006/main" xmlns:w14="http://schemas.microsoft.com/office/word/2010/wordml" xmlns:w15="http://schemas.microsoft.com/office/word/2012/wordml" xmlns:w16cex="http://schemas.microsoft.com/office/word/2018/wordml/cex" xmlns:w16cid="http://schemas.microsoft.com/office/word/2016/wordml/cid" xmlns:w16="http://schemas.microsoft.com/office/word/2018/wordml" xmlns:w16du="http://schemas.microsoft.com/office/word/2023/wordml/word16du" xmlns:w16sdtdh="http://schemas.microsoft.com/office/word/2020/wordml/sdtdatahash" xmlns:w16sdtfl="http://schemas.microsoft.com/office/word/2024/wordml/sdtformatlock" xmlns:w16se="http://schemas.microsoft.com/office/word/2015/wordml/symex" xmlns:wpg="http://schemas.microsoft.com/office/word/2010/wordprocessingGroup" xmlns:wpi="http://schemas.microsoft.com/office/word/2010/wordprocessingInk" xmlns:wne="http://schemas.microsoft.com/office/word/2006/wordml" xmlns:wps="http://schemas.microsoft.com/office/word/2010/wordprocessingShape" mc:Ignorable="w14 w15 w16se w16cid w16 w16cex w16sdtdh w16sdtfl w16du wp14">
+  <w:p>
+    <w:pPr>
+      <w:pStyle w:val="Footer"/>
+    </w:pPr>
+  </w:p>
+</w:ftr>
+</file>
+
+<file path=word/footer2.xml><?xml version="1.0" encoding="utf-8"?>
+<w:ftr xmlns:wpc="http://schemas.microsoft.com/office/word/2010/wordprocessingCanvas" xmlns:cx="http://schemas.microsoft.com/office/drawing/2014/chartex" xmlns:cx1="http://schemas.microsoft.com/office/drawing/2015/9/8/chartex" xmlns:cx2="http://schemas.microsoft.com/office/drawing/2015/10/21/chartex" xmlns:cx3="http://schemas.microsoft.com/office/drawing/2016/5/9/chartex" xmlns:cx4="http://schemas.microsoft.com/office/drawing/2016/5/10/chartex" xmlns:cx5="http://schemas.microsoft.com/office/drawing/2016/5/11/chartex" xmlns:cx6="http://schemas.microsoft.com/office/drawing/2016/5/12/chartex" xmlns:cx7="http://schemas.microsoft.com/office/drawing/2016/5/13/chartex" xmlns:cx8="http://schemas.microsoft.com/office/drawing/2016/5/14/chartex" xmlns:mc="http://schemas.openxmlformats.org/markup-compatibility/2006" xmlns:aink="http://schemas.microsoft.com/office/drawing/2016/ink" xmlns:am3d="http://schemas.microsoft.com/office/drawing/2017/model3d" xmlns:o="urn:schemas-microsoft-com:office:office" xmlns:oel="http://schemas.microsoft.com/office/2019/extlst" xmlns:r="http://schemas.openxmlformats.org/officeDocument/2006/relationships" xmlns:m="http://schemas.openxmlformats.org/officeDocument/2006/math" xmlns:v="urn:schemas-microsoft-com:vml" xmlns:wp14="http://schemas.microsoft.com/office/word/2010/wordprocessingDrawing" xmlns:wp="http://schemas.openxmlformats.org/drawingml/2006/wordprocessingDrawing" xmlns:w10="urn:schemas-microsoft-com:office:word" xmlns:w="http://schemas.openxmlformats.org/wordprocessingml/2006/main" xmlns:w14="http://schemas.microsoft.com/office/word/2010/wordml" xmlns:w15="http://schemas.microsoft.com/office/word/2012/wordml" xmlns:w16cex="http://schemas.microsoft.com/office/word/2018/wordml/cex" xmlns:w16cid="http://schemas.microsoft.com/office/word/2016/wordml/cid" xmlns:w16="http://schemas.microsoft.com/office/word/2018/wordml" xmlns:w16du="http://schemas.microsoft.com/office/word/2023/wordml/word16du" xmlns:w16sdtdh="http://schemas.microsoft.com/office/word/2020/wordml/sdtdatahash" xmlns:w16sdtfl="http://schemas.microsoft.com/office/word/2024/wordml/sdtformatlock" xmlns:w16se="http://schemas.microsoft.com/office/word/2015/wordml/symex" xmlns:wpg="http://schemas.microsoft.com/office/word/2010/wordprocessingGroup" xmlns:wpi="http://schemas.microsoft.com/office/word/2010/wordprocessingInk" xmlns:wne="http://schemas.microsoft.com/office/word/2006/wordml" xmlns:wps="http://schemas.microsoft.com/office/word/2010/wordprocessingShape" mc:Ignorable="w14 w15 w16se w16cid w16 w16cex w16sdtdh w16sdtfl w16du wp14">
+  <w:p>
+    <w:pPr>
+      <w:pStyle w:val="Footer"/>
+      <w:jc w:val="right"/>
+    </w:pPr>
+    <w:r>
+      <w:t xml:space="preserve">PAGE: </w:t>
+    </w:r>
+    <w:sdt>
+      <w:sdtPr>
+        <w:id w:val="192731878"/>
+        <w:docPartObj>
+          <w:docPartGallery w:val="Page Numbers (Bottom of Page)"/>
+          <w:docPartUnique/>
+        </w:docPartObj>
+      </w:sdtPr>
+      <w:sdtEndPr>
+        <w:rPr>
+          <w:noProof/>
+        </w:rPr>
+      </w:sdtEndPr>
+      <w:sdtContent>
+        <w:r>
+          <w:fldChar w:fldCharType="begin"/>
+        </w:r>
+        <w:r>
+          <w:instrText xml:space="preserve"> PAGE   \* MERGEFORMAT </w:instrText>
+        </w:r>
+        <w:r>
+          <w:fldChar w:fldCharType="separate"/>
+        </w:r>
+        <w:r>
+          <w:rPr>
+            <w:noProof/>
+          </w:rPr>
+          <w:t>2</w:t>
+        </w:r>
+        <w:r>
+          <w:rPr>
+            <w:noProof/>
+          </w:rPr>
+          <w:fldChar w:fldCharType="end"/>
+        </w:r>
+      </w:sdtContent>
+    </w:sdt>
+  </w:p>
+  <w:p>
+    <w:pPr>
+      <w:pStyle w:val="Footer"/>
+    </w:pPr>
+  </w:p>
+</w:ftr>
+</file>
+
+<file path=word/footer3.xml><?xml version="1.0" encoding="utf-8"?>
+<w:ftr xmlns:wpc="http://schemas.microsoft.com/office/word/2010/wordprocessingCanvas" xmlns:cx="http://schemas.microsoft.com/office/drawing/2014/chartex" xmlns:cx1="http://schemas.microsoft.com/office/drawing/2015/9/8/chartex" xmlns:cx2="http://schemas.microsoft.com/office/drawing/2015/10/21/chartex" xmlns:cx3="http://schemas.microsoft.com/office/drawing/2016/5/9/chartex" xmlns:cx4="http://schemas.microsoft.com/office/drawing/2016/5/10/chartex" xmlns:cx5="http://schemas.microsoft.com/office/drawing/2016/5/11/chartex" xmlns:cx6="http://schemas.microsoft.com/office/drawing/2016/5/12/chartex" xmlns:cx7="http://schemas.microsoft.com/office/drawing/2016/5/13/chartex" xmlns:cx8="http://schemas.microsoft.com/office/drawing/2016/5/14/chartex" xmlns:mc="http://schemas.openxmlformats.org/markup-compatibility/2006" xmlns:aink="http://schemas.microsoft.com/office/drawing/2016/ink" xmlns:am3d="http://schemas.microsoft.com/office/drawing/2017/model3d" xmlns:o="urn:schemas-microsoft-com:office:office" xmlns:oel="http://schemas.microsoft.com/office/2019/extlst" xmlns:r="http://schemas.openxmlformats.org/officeDocument/2006/relationships" xmlns:m="http://schemas.openxmlformats.org/officeDocument/2006/math" xmlns:v="urn:schemas-microsoft-com:vml" xmlns:wp14="http://schemas.microsoft.com/office/word/2010/wordprocessingDrawing" xmlns:wp="http://schemas.openxmlformats.org/drawingml/2006/wordprocessingDrawing" xmlns:w10="urn:schemas-microsoft-com:office:word" xmlns:w="http://schemas.openxmlformats.org/wordprocessingml/2006/main" xmlns:w14="http://schemas.microsoft.com/office/word/2010/wordml" xmlns:w15="http://schemas.microsoft.com/office/word/2012/wordml" xmlns:w16cex="http://schemas.microsoft.com/office/word/2018/wordml/cex" xmlns:w16cid="http://schemas.microsoft.com/office/word/2016/wordml/cid" xmlns:w16="http://schemas.microsoft.com/office/word/2018/wordml" xmlns:w16du="http://schemas.microsoft.com/office/word/2023/wordml/word16du" xmlns:w16sdtdh="http://schemas.microsoft.com/office/word/2020/wordml/sdtdatahash" xmlns:w16sdtfl="http://schemas.microsoft.com/office/word/2024/wordml/sdtformatlock" xmlns:w16se="http://schemas.microsoft.com/office/word/2015/wordml/symex" xmlns:wpg="http://schemas.microsoft.com/office/word/2010/wordprocessingGroup" xmlns:wpi="http://schemas.microsoft.com/office/word/2010/wordprocessingInk" xmlns:wne="http://schemas.microsoft.com/office/word/2006/wordml" xmlns:wps="http://schemas.microsoft.com/office/word/2010/wordprocessingShape" mc:Ignorable="w14 w15 w16se w16cid w16 w16cex w16sdtdh w16sdtfl w16du wp14">
+  <w:p>
+    <w:pPr>
+      <w:pStyle w:val="Footer"/>
+    </w:pPr>
+  </w:p>
+</w:ftr>
+</file>
+
+<file path=word/footnotes.xml><?xml version="1.0" encoding="utf-8"?>
+<w:footnotes xmlns:wpc="http://schemas.microsoft.com/office/word/2010/wordprocessingCanvas" xmlns:cx="http://schemas.microsoft.com/office/drawing/2014/chartex" xmlns:cx1="http://schemas.microsoft.com/office/drawing/2015/9/8/chartex" xmlns:cx2="http://schemas.microsoft.com/office/drawing/2015/10/21/chartex" xmlns:cx3="http://schemas.microsoft.com/office/drawing/2016/5/9/chartex" xmlns:cx4="http://schemas.microsoft.com/office/drawing/2016/5/10/chartex" xmlns:cx5="http://schemas.microsoft.com/office/drawing/2016/5/11/chartex" xmlns:cx6="http://schemas.microsoft.com/office/drawing/2016/5/12/chartex" xmlns:cx7="http://schemas.microsoft.com/office/drawing/2016/5/13/chartex" xmlns:cx8="http://schemas.microsoft.com/office/drawing/2016/5/14/chartex" xmlns:mc="http://schemas.openxmlformats.org/markup-compatibility/2006" xmlns:aink="http://schemas.microsoft.com/office/drawing/2016/ink" xmlns:am3d="http://schemas.microsoft.com/office/drawing/2017/model3d" xmlns:o="urn:schemas-microsoft-com:office:office" xmlns:oel="http://schemas.microsoft.com/office/2019/extlst" xmlns:r="http://schemas.openxmlformats.org/officeDocument/2006/relationships" xmlns:m="http://schemas.openxmlformats.org/officeDocument/2006/math" xmlns:v="urn:schemas-microsoft-com:vml" xmlns:wp14="http://schemas.microsoft.com/office/word/2010/wordprocessingDrawing" xmlns:wp="http://schemas.openxmlformats.org/drawingml/2006/wordprocessingDrawing" xmlns:w10="urn:schemas-microsoft-com:office:word" xmlns:w="http://schemas.openxmlformats.org/wordprocessingml/2006/main" xmlns:w14="http://schemas.microsoft.com/office/word/2010/wordml" xmlns:w15="http://schemas.microsoft.com/office/word/2012/wordml" xmlns:w16cex="http://schemas.microsoft.com/office/word/2018/wordml/cex" xmlns:w16cid="http://schemas.microsoft.com/office/word/2016/wordml/cid" xmlns:w16="http://schemas.microsoft.com/office/word/2018/wordml" xmlns:w16du="http://schemas.microsoft.com/office/word/2023/wordml/word16du" xmlns:w16sdtdh="http://schemas.microsoft.com/office/word/2020/wordml/sdtdatahash" xmlns:w16sdtfl="http://schemas.microsoft.com/office/word/2024/wordml/sdtformatlock" xmlns:w16se="http://schemas.microsoft.com/office/word/2015/wordml/symex" xmlns:wpg="http://schemas.microsoft.com/office/word/2010/wordprocessingGroup" xmlns:wpi="http://schemas.microsoft.com/office/word/2010/wordprocessingInk" xmlns:wne="http://schemas.microsoft.com/office/word/2006/wordml" xmlns:wps="http://schemas.microsoft.com/office/word/2010/wordprocessingShape" mc:Ignorable="w14 w15 w16se w16cid w16 w16cex w16sdtdh w16sdtfl w16du wp14">
+  <w:footnote w:type="separator" w:id="-1">
+    <w:p>
+      <w:pPr>
+        <w:spacing w:after="0" w:line="240" w:lineRule="auto"/>
+      </w:pPr>
+      <w:r>
+        <w:separator/>
+      </w:r>
+    </w:p>
+  </w:footnote>
+  <w:footnote w:type="continuationSeparator" w:id="0">
+    <w:p>
+      <w:pPr>
+        <w:spacing w:after="0" w:line="240" w:lineRule="auto"/>
+      </w:pPr>
+      <w:r>
+        <w:continuationSeparator/>
+      </w:r>
+    </w:p>
+  </w:footnote>
+</w:footnotes>
+</file>
+
+<file path=word/header1.xml><?xml version="1.0" encoding="utf-8"?>
+<w:hdr xmlns:wpc="http://schemas.microsoft.com/office/word/2010/wordprocessingCanvas" xmlns:cx="http://schemas.microsoft.com/office/drawing/2014/chartex" xmlns:cx1="http://schemas.microsoft.com/office/drawing/2015/9/8/chartex" xmlns:cx2="http://schemas.microsoft.com/office/drawing/2015/10/21/chartex" xmlns:cx3="http://schemas.microsoft.com/office/drawing/2016/5/9/chartex" xmlns:cx4="http://schemas.microsoft.com/office/drawing/2016/5/10/chartex" xmlns:cx5="http://schemas.microsoft.com/office/drawing/2016/5/11/chartex" xmlns:cx6="http://schemas.microsoft.com/office/drawing/2016/5/12/chartex" xmlns:cx7="http://schemas.microsoft.com/office/drawing/2016/5/13/chartex" xmlns:cx8="http://schemas.microsoft.com/office/drawing/2016/5/14/chartex" xmlns:mc="http://schemas.openxmlformats.org/markup-compatibility/2006" xmlns:aink="http://schemas.microsoft.com/office/drawing/2016/ink" xmlns:am3d="http://schemas.microsoft.com/office/drawing/2017/model3d" xmlns:o="urn:schemas-microsoft-com:office:office" xmlns:oel="http://schemas.microsoft.com/office/2019/extlst" xmlns:r="http://schemas.openxmlformats.org/officeDocument/2006/relationships" xmlns:m="http://schemas.openxmlformats.org/officeDocument/2006/math" xmlns:v="urn:schemas-microsoft-com:vml" xmlns:wp14="http://schemas.microsoft.com/office/word/2010/wordprocessingDrawing" xmlns:wp="http://schemas.openxmlformats.org/drawingml/2006/wordprocessingDrawing" xmlns:w10="urn:schemas-microsoft-com:office:word" xmlns:w="http://schemas.openxmlformats.org/wordprocessingml/2006/main" xmlns:w14="http://schemas.microsoft.com/office/word/2010/wordml" xmlns:w15="http://schemas.microsoft.com/office/word/2012/wordml" xmlns:w16cex="http://schemas.microsoft.com/office/word/2018/wordml/cex" xmlns:w16cid="http://schemas.microsoft.com/office/word/2016/wordml/cid" xmlns:w16="http://schemas.microsoft.com/office/word/2018/wordml" xmlns:w16du="http://schemas.microsoft.com/office/word/2023/wordml/word16du" xmlns:w16sdtdh="http://schemas.microsoft.com/office/word/2020/wordml/sdtdatahash" xmlns:w16sdtfl="http://schemas.microsoft.com/office/word/2024/wordml/sdtformatlock" xmlns:w16se="http://schemas.microsoft.com/office/word/2015/wordml/symex" xmlns:wpg="http://schemas.microsoft.com/office/word/2010/wordprocessingGroup" xmlns:wpi="http://schemas.microsoft.com/office/word/2010/wordprocessingInk" xmlns:wne="http://schemas.microsoft.com/office/word/2006/wordml" xmlns:wps="http://schemas.microsoft.com/office/word/2010/wordprocessingShape" mc:Ignorable="w14 w15 w16se w16cid w16 w16cex w16sdtdh w16sdtfl w16du wp14">
+  <w:p>
+    <w:pPr>
+      <w:pStyle w:val="Header"/>
+    </w:pPr>
+  </w:p>
+</w:hdr>
+</file>
+
+<file path=word/header2.xml><?xml version="1.0" encoding="utf-8"?>
+<w:hdr xmlns:wpc="http://schemas.microsoft.com/office/word/2010/wordprocessingCanvas" xmlns:cx="http://schemas.microsoft.com/office/drawing/2014/chartex" xmlns:cx1="http://schemas.microsoft.com/office/drawing/2015/9/8/chartex" xmlns:cx2="http://schemas.microsoft.com/office/drawing/2015/10/21/chartex" xmlns:cx3="http://schemas.microsoft.com/office/drawing/2016/5/9/chartex" xmlns:cx4="http://schemas.microsoft.com/office/drawing/2016/5/10/chartex" xmlns:cx5="http://schemas.microsoft.com/office/drawing/2016/5/11/chartex" xmlns:cx6="http://schemas.microsoft.com/office/drawing/2016/5/12/chartex" xmlns:cx7="http://schemas.microsoft.com/office/drawing/2016/5/13/chartex" xmlns:cx8="http://schemas.microsoft.com/office/drawing/2016/5/14/chartex" xmlns:mc="http://schemas.openxmlformats.org/markup-compatibility/2006" xmlns:aink="http://schemas.microsoft.com/office/drawing/2016/ink" xmlns:am3d="http://schemas.microsoft.com/office/drawing/2017/model3d" xmlns:o="urn:schemas-microsoft-com:office:office" xmlns:oel="http://schemas.microsoft.com/office/2019/extlst" xmlns:r="http://schemas.openxmlformats.org/officeDocument/2006/relationships" xmlns:m="http://schemas.openxmlformats.org/officeDocument/2006/math" xmlns:v="urn:schemas-microsoft-com:vml" xmlns:wp14="http://schemas.microsoft.com/office/word/2010/wordprocessingDrawing" xmlns:wp="http://schemas.openxmlformats.org/drawingml/2006/wordprocessingDrawing" xmlns:w10="urn:schemas-microsoft-com:office:word" xmlns:w="http://schemas.openxmlformats.org/wordprocessingml/2006/main" xmlns:w14="http://schemas.microsoft.com/office/word/2010/wordml" xmlns:w15="http://schemas.microsoft.com/office/word/2012/wordml" xmlns:w16cex="http://schemas.microsoft.com/office/word/2018/wordml/cex" xmlns:w16cid="http://schemas.microsoft.com/office/word/2016/wordml/cid" xmlns:w16="http://schemas.microsoft.com/office/word/2018/wordml" xmlns:w16du="http://schemas.microsoft.com/office/word/2023/wordml/word16du" xmlns:w16sdtdh="http://schemas.microsoft.com/office/word/2020/wordml/sdtdatahash" xmlns:w16sdtfl="http://schemas.microsoft.com/office/word/2024/wordml/sdtformatlock" xmlns:w16se="http://schemas.microsoft.com/office/word/2015/wordml/symex" xmlns:wpg="http://schemas.microsoft.com/office/word/2010/wordprocessingGroup" xmlns:wpi="http://schemas.microsoft.com/office/word/2010/wordprocessingInk" xmlns:wne="http://schemas.microsoft.com/office/word/2006/wordml" xmlns:wps="http://schemas.microsoft.com/office/word/2010/wordprocessingShape" mc:Ignorable="w14 w15 w16se w16cid w16 w16cex w16sdtdh w16sdtfl w16du wp14">
+  <w:p>
+    <w:pPr>
+      <w:pStyle w:val="Header"/>
+    </w:pPr>
+  </w:p>
+</w:hdr>
+</file>
+
+<file path=word/header3.xml><?xml version="1.0" encoding="utf-8"?>
+<w:hdr xmlns:wpc="http://schemas.microsoft.com/office/word/2010/wordprocessingCanvas" xmlns:cx="http://schemas.microsoft.com/office/drawing/2014/chartex" xmlns:cx1="http://schemas.microsoft.com/office/drawing/2015/9/8/chartex" xmlns:cx2="http://schemas.microsoft.com/office/drawing/2015/10/21/chartex" xmlns:cx3="http://schemas.microsoft.com/office/drawing/2016/5/9/chartex" xmlns:cx4="http://schemas.microsoft.com/office/drawing/2016/5/10/chartex" xmlns:cx5="http://schemas.microsoft.com/office/drawing/2016/5/11/chartex" xmlns:cx6="http://schemas.microsoft.com/office/drawing/2016/5/12/chartex" xmlns:cx7="http://schemas.microsoft.com/office/drawing/2016/5/13/chartex" xmlns:cx8="http://schemas.microsoft.com/office/drawing/2016/5/14/chartex" xmlns:mc="http://schemas.openxmlformats.org/markup-compatibility/2006" xmlns:aink="http://schemas.microsoft.com/office/drawing/2016/ink" xmlns:am3d="http://schemas.microsoft.com/office/drawing/2017/model3d" xmlns:o="urn:schemas-microsoft-com:office:office" xmlns:oel="http://schemas.microsoft.com/office/2019/extlst" xmlns:r="http://schemas.openxmlformats.org/officeDocument/2006/relationships" xmlns:m="http://schemas.openxmlformats.org/officeDocument/2006/math" xmlns:v="urn:schemas-microsoft-com:vml" xmlns:wp14="http://schemas.microsoft.com/office/word/2010/wordprocessingDrawing" xmlns:wp="http://schemas.openxmlformats.org/drawingml/2006/wordprocessingDrawing" xmlns:w10="urn:schemas-microsoft-com:office:word" xmlns:w="http://schemas.openxmlformats.org/wordprocessingml/2006/main" xmlns:w14="http://schemas.microsoft.com/office/word/2010/wordml" xmlns:w15="http://schemas.microsoft.com/office/word/2012/wordml" xmlns:w16cex="http://schemas.microsoft.com/office/word/2018/wordml/cex" xmlns:w16cid="http://schemas.microsoft.com/office/word/2016/wordml/cid" xmlns:w16="http://schemas.microsoft.com/office/word/2018/wordml" xmlns:w16du="http://schemas.microsoft.com/office/word/2023/wordml/word16du" xmlns:w16sdtdh="http://schemas.microsoft.com/office/word/2020/wordml/sdtdatahash" xmlns:w16sdtfl="http://schemas.microsoft.com/office/word/2024/wordml/sdtformatlock" xmlns:w16se="http://schemas.microsoft.com/office/word/2015/wordml/symex" xmlns:wpg="http://schemas.microsoft.com/office/word/2010/wordprocessingGroup" xmlns:wpi="http://schemas.microsoft.com/office/word/2010/wordprocessingInk" xmlns:wne="http://schemas.microsoft.com/office/word/2006/wordml" xmlns:wps="http://schemas.microsoft.com/office/word/2010/wordprocessingShape" mc:Ignorable="w14 w15 w16se w16cid w16 w16cex w16sdtdh w16sdtfl w16du wp14">
+  <w:p>
+    <w:pPr>
+      <w:pStyle w:val="Header"/>
+    </w:pPr>
+  </w:p>
+</w:hdr>
+</file>
+
 <file path=word/numbering.xml><?xml version="1.0" encoding="utf-8"?>
-<w:numbering xmlns:wpc="http://schemas.microsoft.com/office/word/2010/wordprocessingCanvas" xmlns:cx="http://schemas.microsoft.com/office/drawing/2014/chartex" xmlns:cx1="http://schemas.microsoft.com/office/drawing/2015/9/8/chartex" xmlns:cx2="http://schemas.microsoft.com/office/drawing/2015/10/21/chartex" xmlns:cx3="http://schemas.microsoft.com/office/drawing/2016/5/9/chartex" xmlns:cx4="http://schemas.microsoft.com/office/drawing/2016/5/10/chartex" xmlns:cx5="http://schemas.microsoft.com/office/drawing/2016/5/11/chartex" xmlns:cx6="http://schemas.microsoft.com/office/drawing/2016/5/12/chartex" xmlns:cx7="http://schemas.microsoft.com/office/drawing/2016/5/13/chartex" xmlns:cx8="http://schemas.microsoft.com/office/drawing/2016/5/14/chartex" xmlns:mc="http://schemas.openxmlformats.org/markup-compatibility/2006" xmlns:aink="http://schemas.microsoft.com/office/drawing/2016/ink" xmlns:am3d="http://schemas.microsoft.com/office/drawing/2017/model3d" xmlns:o="urn:schemas-microsoft-com:office:office" xmlns:oel="http://schemas.microsoft.com/office/2019/extlst" xmlns:r="http://schemas.openxmlformats.org/officeDocument/2006/relationships" xmlns:m="http://schemas.openxmlformats.org/officeDocument/2006/math" xmlns:v="urn:schemas-microsoft-com:vml" xmlns:wp14="http://schemas.microsoft.com/office/word/2010/wordprocessingDrawing" xmlns:wp="http://schemas.openxmlformats.org/drawingml/2006/wordprocessingDrawing" xmlns:w10="urn:schemas-microsoft-com:office:word" xmlns:w="http://schemas.openxmlformats.org/wordprocessingml/2006/main" xmlns:w14="http://schemas.microsoft.com/office/word/2010/wordml" xmlns:w15="http://schemas.microsoft.com/office/word/2012/wordml" xmlns:w16cei="http://schemas.microsoft.com/office/word/2026/wordml/cei" xmlns:w16cex="http://schemas.microsoft.com/office/word/2018/wordml/cex" xmlns:w16cid="http://schemas.microsoft.com/office/word/2016/wordml/cid" xmlns:w16="http://schemas.microsoft.com/office/word/2018/wordml" xmlns:w16du="http://schemas.microsoft.com/office/word/2023/wordml/word16du" xmlns:w16sdtdh="http://schemas.microsoft.com/office/word/2020/wordml/sdtdatahash" xmlns:w16sdtfl="http://schemas.microsoft.com/office/word/2024/wordml/sdtformatlock" xmlns:w16se="http://schemas.microsoft.com/office/word/2015/wordml/symex" xmlns:wpg="http://schemas.microsoft.com/office/word/2010/wordprocessingGroup" xmlns:wpi="http://schemas.microsoft.com/office/word/2010/wordprocessingInk" xmlns:wne="http://schemas.microsoft.com/office/word/2006/wordml" xmlns:wps="http://schemas.microsoft.com/office/word/2010/wordprocessingShape" mc:Ignorable="w14 w15 w16se w16cid w16 w16cex w16sdtdh w16sdtfl w16du wp14">
+<w:numbering xmlns:wpc="http://schemas.microsoft.com/office/word/2010/wordprocessingCanvas" xmlns:cx="http://schemas.microsoft.com/office/drawing/2014/chartex" xmlns:cx1="http://schemas.microsoft.com/office/drawing/2015/9/8/chartex" xmlns:cx2="http://schemas.microsoft.com/office/drawing/2015/10/21/chartex" xmlns:cx3="http://schemas.microsoft.com/office/drawing/2016/5/9/chartex" xmlns:cx4="http://schemas.microsoft.com/office/drawing/2016/5/10/chartex" xmlns:cx5="http://schemas.microsoft.com/office/drawing/2016/5/11/chartex" xmlns:cx6="http://schemas.microsoft.com/office/drawing/2016/5/12/chartex" xmlns:cx7="http://schemas.microsoft.com/office/drawing/2016/5/13/chartex" xmlns:cx8="http://schemas.microsoft.com/office/drawing/2016/5/14/chartex" xmlns:mc="http://schemas.openxmlformats.org/markup-compatibility/2006" xmlns:aink="http://schemas.microsoft.com/office/drawing/2016/ink" xmlns:am3d="http://schemas.microsoft.com/office/drawing/2017/model3d" xmlns:o="urn:schemas-microsoft-com:office:office" xmlns:oel="http://schemas.microsoft.com/office/2019/extlst" xmlns:r="http://schemas.openxmlformats.org/officeDocument/2006/relationships" xmlns:m="http://schemas.openxmlformats.org/officeDocument/2006/math" xmlns:v="urn:schemas-microsoft-com:vml" xmlns:wp14="http://schemas.microsoft.com/office/word/2010/wordprocessingDrawing" xmlns:wp="http://schemas.openxmlformats.org/drawingml/2006/wordprocessingDrawing" xmlns:w10="urn:schemas-microsoft-com:office:word" xmlns:w="http://schemas.openxmlformats.org/wordprocessingml/2006/main" xmlns:w14="http://schemas.microsoft.com/office/word/2010/wordml" xmlns:w15="http://schemas.microsoft.com/office/word/2012/wordml" xmlns:w16cex="http://schemas.microsoft.com/office/word/2018/wordml/cex" xmlns:w16cid="http://schemas.microsoft.com/office/word/2016/wordml/cid" xmlns:w16="http://schemas.microsoft.com/office/word/2018/wordml" xmlns:w16du="http://schemas.microsoft.com/office/word/2023/wordml/word16du" xmlns:w16sdtdh="http://schemas.microsoft.com/office/word/2020/wordml/sdtdatahash" xmlns:w16sdtfl="http://schemas.microsoft.com/office/word/2024/wordml/sdtformatlock" xmlns:w16se="http://schemas.microsoft.com/office/word/2015/wordml/symex" xmlns:wpg="http://schemas.microsoft.com/office/word/2010/wordprocessingGroup" xmlns:wpi="http://schemas.microsoft.com/office/word/2010/wordprocessingInk" xmlns:wne="http://schemas.microsoft.com/office/word/2006/wordml" xmlns:wps="http://schemas.microsoft.com/office/word/2010/wordprocessingShape" mc:Ignorable="w14 w15 w16se w16cid w16 w16cex w16sdtdh w16sdtfl w16du wp14">
   <w:abstractNum w:abstractNumId="0" w15:restartNumberingAfterBreak="0">
+    <w:nsid w:val="02E71572"/>
+    <w:multiLevelType w:val="multilevel"/>
+    <w:tmpl w:val="F984C218"/>
+    <w:lvl w:ilvl="0">
+      <w:start w:val="1"/>
+      <w:numFmt w:val="bullet"/>
+      <w:lvlText w:val=""/>
+      <w:lvlJc w:val="left"/>
+      <w:pPr>
+        <w:tabs>
+          <w:tab w:val="num" w:pos="720"/>
+        </w:tabs>
+        <w:ind w:left="720" w:hanging="360"/>
+      </w:pPr>
+      <w:rPr>
+        <w:rFonts w:ascii="Symbol" w:hAnsi="Symbol" w:hint="default"/>
+        <w:sz w:val="20"/>
+      </w:rPr>
+    </w:lvl>
+    <w:lvl w:ilvl="1" w:tentative="1">
+      <w:start w:val="1"/>
+      <w:numFmt w:val="bullet"/>
+      <w:lvlText w:val="o"/>
+      <w:lvlJc w:val="left"/>
+      <w:pPr>
+        <w:tabs>
+          <w:tab w:val="num" w:pos="1440"/>
+        </w:tabs>
+        <w:ind w:left="1440" w:hanging="360"/>
+      </w:pPr>
+      <w:rPr>
+        <w:rFonts w:ascii="Courier New" w:hAnsi="Courier New" w:hint="default"/>
+        <w:sz w:val="20"/>
+      </w:rPr>
+    </w:lvl>
+    <w:lvl w:ilvl="2" w:tentative="1">
+      <w:start w:val="1"/>
+      <w:numFmt w:val="bullet"/>
+      <w:lvlText w:val=""/>
+      <w:lvlJc w:val="left"/>
+      <w:pPr>
+        <w:tabs>
+          <w:tab w:val="num" w:pos="2160"/>
+        </w:tabs>
+        <w:ind w:left="2160" w:hanging="360"/>
+      </w:pPr>
+      <w:rPr>
+        <w:rFonts w:ascii="Wingdings" w:hAnsi="Wingdings" w:hint="default"/>
+        <w:sz w:val="20"/>
+      </w:rPr>
+    </w:lvl>
+    <w:lvl w:ilvl="3" w:tentative="1">
+      <w:start w:val="1"/>
+      <w:numFmt w:val="bullet"/>
+      <w:lvlText w:val=""/>
+      <w:lvlJc w:val="left"/>
+      <w:pPr>
+        <w:tabs>
+          <w:tab w:val="num" w:pos="2880"/>
+        </w:tabs>
+        <w:ind w:left="2880" w:hanging="360"/>
+      </w:pPr>
+      <w:rPr>
+        <w:rFonts w:ascii="Wingdings" w:hAnsi="Wingdings" w:hint="default"/>
+        <w:sz w:val="20"/>
+      </w:rPr>
+    </w:lvl>
+    <w:lvl w:ilvl="4" w:tentative="1">
+      <w:start w:val="1"/>
+      <w:numFmt w:val="bullet"/>
+      <w:lvlText w:val=""/>
+      <w:lvlJc w:val="left"/>
+      <w:pPr>
+        <w:tabs>
+          <w:tab w:val="num" w:pos="3600"/>
+        </w:tabs>
+        <w:ind w:left="3600" w:hanging="360"/>
+      </w:pPr>
+      <w:rPr>
+        <w:rFonts w:ascii="Wingdings" w:hAnsi="Wingdings" w:hint="default"/>
+        <w:sz w:val="20"/>
+      </w:rPr>
+    </w:lvl>
+    <w:lvl w:ilvl="5" w:tentative="1">
+      <w:start w:val="1"/>
+      <w:numFmt w:val="bullet"/>
+      <w:lvlText w:val=""/>
+      <w:lvlJc w:val="left"/>
+      <w:pPr>
+        <w:tabs>
+          <w:tab w:val="num" w:pos="4320"/>
+        </w:tabs>
+        <w:ind w:left="4320" w:hanging="360"/>
+      </w:pPr>
+      <w:rPr>
+        <w:rFonts w:ascii="Wingdings" w:hAnsi="Wingdings" w:hint="default"/>
+        <w:sz w:val="20"/>
+      </w:rPr>
+    </w:lvl>
+    <w:lvl w:ilvl="6" w:tentative="1">
+      <w:start w:val="1"/>
+      <w:numFmt w:val="bullet"/>
+      <w:lvlText w:val=""/>
+      <w:lvlJc w:val="left"/>
+      <w:pPr>
+        <w:tabs>
+          <w:tab w:val="num" w:pos="5040"/>
+        </w:tabs>
+        <w:ind w:left="5040" w:hanging="360"/>
+      </w:pPr>
+      <w:rPr>
+        <w:rFonts w:ascii="Wingdings" w:hAnsi="Wingdings" w:hint="default"/>
+        <w:sz w:val="20"/>
+      </w:rPr>
+    </w:lvl>
+    <w:lvl w:ilvl="7" w:tentative="1">
+      <w:start w:val="1"/>
+      <w:numFmt w:val="bullet"/>
+      <w:lvlText w:val=""/>
+      <w:lvlJc w:val="left"/>
+      <w:pPr>
+        <w:tabs>
+          <w:tab w:val="num" w:pos="5760"/>
+        </w:tabs>
+        <w:ind w:left="5760" w:hanging="360"/>
+      </w:pPr>
+      <w:rPr>
+        <w:rFonts w:ascii="Wingdings" w:hAnsi="Wingdings" w:hint="default"/>
+        <w:sz w:val="20"/>
+      </w:rPr>
+    </w:lvl>
+    <w:lvl w:ilvl="8" w:tentative="1">
+      <w:start w:val="1"/>
+      <w:numFmt w:val="bullet"/>
+      <w:lvlText w:val=""/>
+      <w:lvlJc w:val="left"/>
+      <w:pPr>
+        <w:tabs>
+          <w:tab w:val="num" w:pos="6480"/>
+        </w:tabs>
+        <w:ind w:left="6480" w:hanging="360"/>
+      </w:pPr>
+      <w:rPr>
+        <w:rFonts w:ascii="Wingdings" w:hAnsi="Wingdings" w:hint="default"/>
+        <w:sz w:val="20"/>
+      </w:rPr>
+    </w:lvl>
+  </w:abstractNum>
+  <w:abstractNum w:abstractNumId="1" w15:restartNumberingAfterBreak="0">
     <w:nsid w:val="0CB76E38"/>
     <w:multiLevelType w:val="multilevel"/>
     <w:tmpl w:val="3B629608"/>
@@ -600,7 +1330,7 @@
       </w:rPr>
     </w:lvl>
   </w:abstractNum>
-  <w:abstractNum w:abstractNumId="1" w15:restartNumberingAfterBreak="0">
+  <w:abstractNum w:abstractNumId="2" w15:restartNumberingAfterBreak="0">
     <w:nsid w:val="26B650EE"/>
     <w:multiLevelType w:val="multilevel"/>
     <w:tmpl w:val="002624EC"/>
@@ -749,7 +1479,7 @@
       </w:rPr>
     </w:lvl>
   </w:abstractNum>
-  <w:abstractNum w:abstractNumId="2" w15:restartNumberingAfterBreak="0">
+  <w:abstractNum w:abstractNumId="3" w15:restartNumberingAfterBreak="0">
     <w:nsid w:val="2A996A7B"/>
     <w:multiLevelType w:val="multilevel"/>
     <w:tmpl w:val="861C4CAC"/>
@@ -898,7 +1628,7 @@
       </w:rPr>
     </w:lvl>
   </w:abstractNum>
-  <w:abstractNum w:abstractNumId="3" w15:restartNumberingAfterBreak="0">
+  <w:abstractNum w:abstractNumId="4" w15:restartNumberingAfterBreak="0">
     <w:nsid w:val="3A12739A"/>
     <w:multiLevelType w:val="multilevel"/>
     <w:tmpl w:val="4D7A95CA"/>
@@ -1047,7 +1777,752 @@
       </w:rPr>
     </w:lvl>
   </w:abstractNum>
-  <w:abstractNum w:abstractNumId="4" w15:restartNumberingAfterBreak="0">
+  <w:abstractNum w:abstractNumId="5" w15:restartNumberingAfterBreak="0">
+    <w:nsid w:val="403C7919"/>
+    <w:multiLevelType w:val="multilevel"/>
+    <w:tmpl w:val="1196E372"/>
+    <w:lvl w:ilvl="0">
+      <w:start w:val="1"/>
+      <w:numFmt w:val="bullet"/>
+      <w:lvlText w:val=""/>
+      <w:lvlJc w:val="left"/>
+      <w:pPr>
+        <w:tabs>
+          <w:tab w:val="num" w:pos="720"/>
+        </w:tabs>
+        <w:ind w:left="720" w:hanging="360"/>
+      </w:pPr>
+      <w:rPr>
+        <w:rFonts w:ascii="Symbol" w:hAnsi="Symbol" w:hint="default"/>
+        <w:sz w:val="20"/>
+      </w:rPr>
+    </w:lvl>
+    <w:lvl w:ilvl="1" w:tentative="1">
+      <w:start w:val="1"/>
+      <w:numFmt w:val="bullet"/>
+      <w:lvlText w:val="o"/>
+      <w:lvlJc w:val="left"/>
+      <w:pPr>
+        <w:tabs>
+          <w:tab w:val="num" w:pos="1440"/>
+        </w:tabs>
+        <w:ind w:left="1440" w:hanging="360"/>
+      </w:pPr>
+      <w:rPr>
+        <w:rFonts w:ascii="Courier New" w:hAnsi="Courier New" w:hint="default"/>
+        <w:sz w:val="20"/>
+      </w:rPr>
+    </w:lvl>
+    <w:lvl w:ilvl="2" w:tentative="1">
+      <w:start w:val="1"/>
+      <w:numFmt w:val="bullet"/>
+      <w:lvlText w:val=""/>
+      <w:lvlJc w:val="left"/>
+      <w:pPr>
+        <w:tabs>
+          <w:tab w:val="num" w:pos="2160"/>
+        </w:tabs>
+        <w:ind w:left="2160" w:hanging="360"/>
+      </w:pPr>
+      <w:rPr>
+        <w:rFonts w:ascii="Wingdings" w:hAnsi="Wingdings" w:hint="default"/>
+        <w:sz w:val="20"/>
+      </w:rPr>
+    </w:lvl>
+    <w:lvl w:ilvl="3" w:tentative="1">
+      <w:start w:val="1"/>
+      <w:numFmt w:val="bullet"/>
+      <w:lvlText w:val=""/>
+      <w:lvlJc w:val="left"/>
+      <w:pPr>
+        <w:tabs>
+          <w:tab w:val="num" w:pos="2880"/>
+        </w:tabs>
+        <w:ind w:left="2880" w:hanging="360"/>
+      </w:pPr>
+      <w:rPr>
+        <w:rFonts w:ascii="Wingdings" w:hAnsi="Wingdings" w:hint="default"/>
+        <w:sz w:val="20"/>
+      </w:rPr>
+    </w:lvl>
+    <w:lvl w:ilvl="4" w:tentative="1">
+      <w:start w:val="1"/>
+      <w:numFmt w:val="bullet"/>
+      <w:lvlText w:val=""/>
+      <w:lvlJc w:val="left"/>
+      <w:pPr>
+        <w:tabs>
+          <w:tab w:val="num" w:pos="3600"/>
+        </w:tabs>
+        <w:ind w:left="3600" w:hanging="360"/>
+      </w:pPr>
+      <w:rPr>
+        <w:rFonts w:ascii="Wingdings" w:hAnsi="Wingdings" w:hint="default"/>
+        <w:sz w:val="20"/>
+      </w:rPr>
+    </w:lvl>
+    <w:lvl w:ilvl="5" w:tentative="1">
+      <w:start w:val="1"/>
+      <w:numFmt w:val="bullet"/>
+      <w:lvlText w:val=""/>
+      <w:lvlJc w:val="left"/>
+      <w:pPr>
+        <w:tabs>
+          <w:tab w:val="num" w:pos="4320"/>
+        </w:tabs>
+        <w:ind w:left="4320" w:hanging="360"/>
+      </w:pPr>
+      <w:rPr>
+        <w:rFonts w:ascii="Wingdings" w:hAnsi="Wingdings" w:hint="default"/>
+        <w:sz w:val="20"/>
+      </w:rPr>
+    </w:lvl>
+    <w:lvl w:ilvl="6" w:tentative="1">
+      <w:start w:val="1"/>
+      <w:numFmt w:val="bullet"/>
+      <w:lvlText w:val=""/>
+      <w:lvlJc w:val="left"/>
+      <w:pPr>
+        <w:tabs>
+          <w:tab w:val="num" w:pos="5040"/>
+        </w:tabs>
+        <w:ind w:left="5040" w:hanging="360"/>
+      </w:pPr>
+      <w:rPr>
+        <w:rFonts w:ascii="Wingdings" w:hAnsi="Wingdings" w:hint="default"/>
+        <w:sz w:val="20"/>
+      </w:rPr>
+    </w:lvl>
+    <w:lvl w:ilvl="7" w:tentative="1">
+      <w:start w:val="1"/>
+      <w:numFmt w:val="bullet"/>
+      <w:lvlText w:val=""/>
+      <w:lvlJc w:val="left"/>
+      <w:pPr>
+        <w:tabs>
+          <w:tab w:val="num" w:pos="5760"/>
+        </w:tabs>
+        <w:ind w:left="5760" w:hanging="360"/>
+      </w:pPr>
+      <w:rPr>
+        <w:rFonts w:ascii="Wingdings" w:hAnsi="Wingdings" w:hint="default"/>
+        <w:sz w:val="20"/>
+      </w:rPr>
+    </w:lvl>
+    <w:lvl w:ilvl="8" w:tentative="1">
+      <w:start w:val="1"/>
+      <w:numFmt w:val="bullet"/>
+      <w:lvlText w:val=""/>
+      <w:lvlJc w:val="left"/>
+      <w:pPr>
+        <w:tabs>
+          <w:tab w:val="num" w:pos="6480"/>
+        </w:tabs>
+        <w:ind w:left="6480" w:hanging="360"/>
+      </w:pPr>
+      <w:rPr>
+        <w:rFonts w:ascii="Wingdings" w:hAnsi="Wingdings" w:hint="default"/>
+        <w:sz w:val="20"/>
+      </w:rPr>
+    </w:lvl>
+  </w:abstractNum>
+  <w:abstractNum w:abstractNumId="6" w15:restartNumberingAfterBreak="0">
+    <w:nsid w:val="467D71A8"/>
+    <w:multiLevelType w:val="multilevel"/>
+    <w:tmpl w:val="356843B6"/>
+    <w:lvl w:ilvl="0">
+      <w:start w:val="1"/>
+      <w:numFmt w:val="bullet"/>
+      <w:lvlText w:val=""/>
+      <w:lvlJc w:val="left"/>
+      <w:pPr>
+        <w:tabs>
+          <w:tab w:val="num" w:pos="720"/>
+        </w:tabs>
+        <w:ind w:left="720" w:hanging="360"/>
+      </w:pPr>
+      <w:rPr>
+        <w:rFonts w:ascii="Symbol" w:hAnsi="Symbol" w:hint="default"/>
+        <w:sz w:val="20"/>
+      </w:rPr>
+    </w:lvl>
+    <w:lvl w:ilvl="1" w:tentative="1">
+      <w:start w:val="1"/>
+      <w:numFmt w:val="bullet"/>
+      <w:lvlText w:val="o"/>
+      <w:lvlJc w:val="left"/>
+      <w:pPr>
+        <w:tabs>
+          <w:tab w:val="num" w:pos="1440"/>
+        </w:tabs>
+        <w:ind w:left="1440" w:hanging="360"/>
+      </w:pPr>
+      <w:rPr>
+        <w:rFonts w:ascii="Courier New" w:hAnsi="Courier New" w:hint="default"/>
+        <w:sz w:val="20"/>
+      </w:rPr>
+    </w:lvl>
+    <w:lvl w:ilvl="2" w:tentative="1">
+      <w:start w:val="1"/>
+      <w:numFmt w:val="bullet"/>
+      <w:lvlText w:val=""/>
+      <w:lvlJc w:val="left"/>
+      <w:pPr>
+        <w:tabs>
+          <w:tab w:val="num" w:pos="2160"/>
+        </w:tabs>
+        <w:ind w:left="2160" w:hanging="360"/>
+      </w:pPr>
+      <w:rPr>
+        <w:rFonts w:ascii="Wingdings" w:hAnsi="Wingdings" w:hint="default"/>
+        <w:sz w:val="20"/>
+      </w:rPr>
+    </w:lvl>
+    <w:lvl w:ilvl="3" w:tentative="1">
+      <w:start w:val="1"/>
+      <w:numFmt w:val="bullet"/>
+      <w:lvlText w:val=""/>
+      <w:lvlJc w:val="left"/>
+      <w:pPr>
+        <w:tabs>
+          <w:tab w:val="num" w:pos="2880"/>
+        </w:tabs>
+        <w:ind w:left="2880" w:hanging="360"/>
+      </w:pPr>
+      <w:rPr>
+        <w:rFonts w:ascii="Wingdings" w:hAnsi="Wingdings" w:hint="default"/>
+        <w:sz w:val="20"/>
+      </w:rPr>
+    </w:lvl>
+    <w:lvl w:ilvl="4" w:tentative="1">
+      <w:start w:val="1"/>
+      <w:numFmt w:val="bullet"/>
+      <w:lvlText w:val=""/>
+      <w:lvlJc w:val="left"/>
+      <w:pPr>
+        <w:tabs>
+          <w:tab w:val="num" w:pos="3600"/>
+        </w:tabs>
+        <w:ind w:left="3600" w:hanging="360"/>
+      </w:pPr>
+      <w:rPr>
+        <w:rFonts w:ascii="Wingdings" w:hAnsi="Wingdings" w:hint="default"/>
+        <w:sz w:val="20"/>
+      </w:rPr>
+    </w:lvl>
+    <w:lvl w:ilvl="5" w:tentative="1">
+      <w:start w:val="1"/>
+      <w:numFmt w:val="bullet"/>
+      <w:lvlText w:val=""/>
+      <w:lvlJc w:val="left"/>
+      <w:pPr>
+        <w:tabs>
+          <w:tab w:val="num" w:pos="4320"/>
+        </w:tabs>
+        <w:ind w:left="4320" w:hanging="360"/>
+      </w:pPr>
+      <w:rPr>
+        <w:rFonts w:ascii="Wingdings" w:hAnsi="Wingdings" w:hint="default"/>
+        <w:sz w:val="20"/>
+      </w:rPr>
+    </w:lvl>
+    <w:lvl w:ilvl="6" w:tentative="1">
+      <w:start w:val="1"/>
+      <w:numFmt w:val="bullet"/>
+      <w:lvlText w:val=""/>
+      <w:lvlJc w:val="left"/>
+      <w:pPr>
+        <w:tabs>
+          <w:tab w:val="num" w:pos="5040"/>
+        </w:tabs>
+        <w:ind w:left="5040" w:hanging="360"/>
+      </w:pPr>
+      <w:rPr>
+        <w:rFonts w:ascii="Wingdings" w:hAnsi="Wingdings" w:hint="default"/>
+        <w:sz w:val="20"/>
+      </w:rPr>
+    </w:lvl>
+    <w:lvl w:ilvl="7" w:tentative="1">
+      <w:start w:val="1"/>
+      <w:numFmt w:val="bullet"/>
+      <w:lvlText w:val=""/>
+      <w:lvlJc w:val="left"/>
+      <w:pPr>
+        <w:tabs>
+          <w:tab w:val="num" w:pos="5760"/>
+        </w:tabs>
+        <w:ind w:left="5760" w:hanging="360"/>
+      </w:pPr>
+      <w:rPr>
+        <w:rFonts w:ascii="Wingdings" w:hAnsi="Wingdings" w:hint="default"/>
+        <w:sz w:val="20"/>
+      </w:rPr>
+    </w:lvl>
+    <w:lvl w:ilvl="8" w:tentative="1">
+      <w:start w:val="1"/>
+      <w:numFmt w:val="bullet"/>
+      <w:lvlText w:val=""/>
+      <w:lvlJc w:val="left"/>
+      <w:pPr>
+        <w:tabs>
+          <w:tab w:val="num" w:pos="6480"/>
+        </w:tabs>
+        <w:ind w:left="6480" w:hanging="360"/>
+      </w:pPr>
+      <w:rPr>
+        <w:rFonts w:ascii="Wingdings" w:hAnsi="Wingdings" w:hint="default"/>
+        <w:sz w:val="20"/>
+      </w:rPr>
+    </w:lvl>
+  </w:abstractNum>
+  <w:abstractNum w:abstractNumId="7" w15:restartNumberingAfterBreak="0">
+    <w:nsid w:val="49E4007D"/>
+    <w:multiLevelType w:val="multilevel"/>
+    <w:tmpl w:val="B9C06B80"/>
+    <w:lvl w:ilvl="0">
+      <w:start w:val="1"/>
+      <w:numFmt w:val="bullet"/>
+      <w:lvlText w:val=""/>
+      <w:lvlJc w:val="left"/>
+      <w:pPr>
+        <w:tabs>
+          <w:tab w:val="num" w:pos="720"/>
+        </w:tabs>
+        <w:ind w:left="720" w:hanging="360"/>
+      </w:pPr>
+      <w:rPr>
+        <w:rFonts w:ascii="Symbol" w:hAnsi="Symbol" w:hint="default"/>
+        <w:sz w:val="20"/>
+      </w:rPr>
+    </w:lvl>
+    <w:lvl w:ilvl="1">
+      <w:start w:val="1"/>
+      <w:numFmt w:val="bullet"/>
+      <w:lvlText w:val="o"/>
+      <w:lvlJc w:val="left"/>
+      <w:pPr>
+        <w:tabs>
+          <w:tab w:val="num" w:pos="1440"/>
+        </w:tabs>
+        <w:ind w:left="1440" w:hanging="360"/>
+      </w:pPr>
+      <w:rPr>
+        <w:rFonts w:ascii="Courier New" w:hAnsi="Courier New" w:hint="default"/>
+        <w:sz w:val="20"/>
+      </w:rPr>
+    </w:lvl>
+    <w:lvl w:ilvl="2" w:tentative="1">
+      <w:start w:val="1"/>
+      <w:numFmt w:val="bullet"/>
+      <w:lvlText w:val=""/>
+      <w:lvlJc w:val="left"/>
+      <w:pPr>
+        <w:tabs>
+          <w:tab w:val="num" w:pos="2160"/>
+        </w:tabs>
+        <w:ind w:left="2160" w:hanging="360"/>
+      </w:pPr>
+      <w:rPr>
+        <w:rFonts w:ascii="Wingdings" w:hAnsi="Wingdings" w:hint="default"/>
+        <w:sz w:val="20"/>
+      </w:rPr>
+    </w:lvl>
+    <w:lvl w:ilvl="3" w:tentative="1">
+      <w:start w:val="1"/>
+      <w:numFmt w:val="bullet"/>
+      <w:lvlText w:val=""/>
+      <w:lvlJc w:val="left"/>
+      <w:pPr>
+        <w:tabs>
+          <w:tab w:val="num" w:pos="2880"/>
+        </w:tabs>
+        <w:ind w:left="2880" w:hanging="360"/>
+      </w:pPr>
+      <w:rPr>
+        <w:rFonts w:ascii="Wingdings" w:hAnsi="Wingdings" w:hint="default"/>
+        <w:sz w:val="20"/>
+      </w:rPr>
+    </w:lvl>
+    <w:lvl w:ilvl="4" w:tentative="1">
+      <w:start w:val="1"/>
+      <w:numFmt w:val="bullet"/>
+      <w:lvlText w:val=""/>
+      <w:lvlJc w:val="left"/>
+      <w:pPr>
+        <w:tabs>
+          <w:tab w:val="num" w:pos="3600"/>
+        </w:tabs>
+        <w:ind w:left="3600" w:hanging="360"/>
+      </w:pPr>
+      <w:rPr>
+        <w:rFonts w:ascii="Wingdings" w:hAnsi="Wingdings" w:hint="default"/>
+        <w:sz w:val="20"/>
+      </w:rPr>
+    </w:lvl>
+    <w:lvl w:ilvl="5" w:tentative="1">
+      <w:start w:val="1"/>
+      <w:numFmt w:val="bullet"/>
+      <w:lvlText w:val=""/>
+      <w:lvlJc w:val="left"/>
+      <w:pPr>
+        <w:tabs>
+          <w:tab w:val="num" w:pos="4320"/>
+        </w:tabs>
+        <w:ind w:left="4320" w:hanging="360"/>
+      </w:pPr>
+      <w:rPr>
+        <w:rFonts w:ascii="Wingdings" w:hAnsi="Wingdings" w:hint="default"/>
+        <w:sz w:val="20"/>
+      </w:rPr>
+    </w:lvl>
+    <w:lvl w:ilvl="6" w:tentative="1">
+      <w:start w:val="1"/>
+      <w:numFmt w:val="bullet"/>
+      <w:lvlText w:val=""/>
+      <w:lvlJc w:val="left"/>
+      <w:pPr>
+        <w:tabs>
+          <w:tab w:val="num" w:pos="5040"/>
+        </w:tabs>
+        <w:ind w:left="5040" w:hanging="360"/>
+      </w:pPr>
+      <w:rPr>
+        <w:rFonts w:ascii="Wingdings" w:hAnsi="Wingdings" w:hint="default"/>
+        <w:sz w:val="20"/>
+      </w:rPr>
+    </w:lvl>
+    <w:lvl w:ilvl="7" w:tentative="1">
+      <w:start w:val="1"/>
+      <w:numFmt w:val="bullet"/>
+      <w:lvlText w:val=""/>
+      <w:lvlJc w:val="left"/>
+      <w:pPr>
+        <w:tabs>
+          <w:tab w:val="num" w:pos="5760"/>
+        </w:tabs>
+        <w:ind w:left="5760" w:hanging="360"/>
+      </w:pPr>
+      <w:rPr>
+        <w:rFonts w:ascii="Wingdings" w:hAnsi="Wingdings" w:hint="default"/>
+        <w:sz w:val="20"/>
+      </w:rPr>
+    </w:lvl>
+    <w:lvl w:ilvl="8" w:tentative="1">
+      <w:start w:val="1"/>
+      <w:numFmt w:val="bullet"/>
+      <w:lvlText w:val=""/>
+      <w:lvlJc w:val="left"/>
+      <w:pPr>
+        <w:tabs>
+          <w:tab w:val="num" w:pos="6480"/>
+        </w:tabs>
+        <w:ind w:left="6480" w:hanging="360"/>
+      </w:pPr>
+      <w:rPr>
+        <w:rFonts w:ascii="Wingdings" w:hAnsi="Wingdings" w:hint="default"/>
+        <w:sz w:val="20"/>
+      </w:rPr>
+    </w:lvl>
+  </w:abstractNum>
+  <w:abstractNum w:abstractNumId="8" w15:restartNumberingAfterBreak="0">
+    <w:nsid w:val="54F163BE"/>
+    <w:multiLevelType w:val="multilevel"/>
+    <w:tmpl w:val="73BA05B0"/>
+    <w:lvl w:ilvl="0">
+      <w:start w:val="1"/>
+      <w:numFmt w:val="bullet"/>
+      <w:lvlText w:val=""/>
+      <w:lvlJc w:val="left"/>
+      <w:pPr>
+        <w:tabs>
+          <w:tab w:val="num" w:pos="720"/>
+        </w:tabs>
+        <w:ind w:left="720" w:hanging="360"/>
+      </w:pPr>
+      <w:rPr>
+        <w:rFonts w:ascii="Symbol" w:hAnsi="Symbol" w:hint="default"/>
+        <w:sz w:val="20"/>
+      </w:rPr>
+    </w:lvl>
+    <w:lvl w:ilvl="1" w:tentative="1">
+      <w:start w:val="1"/>
+      <w:numFmt w:val="bullet"/>
+      <w:lvlText w:val="o"/>
+      <w:lvlJc w:val="left"/>
+      <w:pPr>
+        <w:tabs>
+          <w:tab w:val="num" w:pos="1440"/>
+        </w:tabs>
+        <w:ind w:left="1440" w:hanging="360"/>
+      </w:pPr>
+      <w:rPr>
+        <w:rFonts w:ascii="Courier New" w:hAnsi="Courier New" w:hint="default"/>
+        <w:sz w:val="20"/>
+      </w:rPr>
+    </w:lvl>
+    <w:lvl w:ilvl="2" w:tentative="1">
+      <w:start w:val="1"/>
+      <w:numFmt w:val="bullet"/>
+      <w:lvlText w:val=""/>
+      <w:lvlJc w:val="left"/>
+      <w:pPr>
+        <w:tabs>
+          <w:tab w:val="num" w:pos="2160"/>
+        </w:tabs>
+        <w:ind w:left="2160" w:hanging="360"/>
+      </w:pPr>
+      <w:rPr>
+        <w:rFonts w:ascii="Wingdings" w:hAnsi="Wingdings" w:hint="default"/>
+        <w:sz w:val="20"/>
+      </w:rPr>
+    </w:lvl>
+    <w:lvl w:ilvl="3" w:tentative="1">
+      <w:start w:val="1"/>
+      <w:numFmt w:val="bullet"/>
+      <w:lvlText w:val=""/>
+      <w:lvlJc w:val="left"/>
+      <w:pPr>
+        <w:tabs>
+          <w:tab w:val="num" w:pos="2880"/>
+        </w:tabs>
+        <w:ind w:left="2880" w:hanging="360"/>
+      </w:pPr>
+      <w:rPr>
+        <w:rFonts w:ascii="Wingdings" w:hAnsi="Wingdings" w:hint="default"/>
+        <w:sz w:val="20"/>
+      </w:rPr>
+    </w:lvl>
+    <w:lvl w:ilvl="4" w:tentative="1">
+      <w:start w:val="1"/>
+      <w:numFmt w:val="bullet"/>
+      <w:lvlText w:val=""/>
+      <w:lvlJc w:val="left"/>
+      <w:pPr>
+        <w:tabs>
+          <w:tab w:val="num" w:pos="3600"/>
+        </w:tabs>
+        <w:ind w:left="3600" w:hanging="360"/>
+      </w:pPr>
+      <w:rPr>
+        <w:rFonts w:ascii="Wingdings" w:hAnsi="Wingdings" w:hint="default"/>
+        <w:sz w:val="20"/>
+      </w:rPr>
+    </w:lvl>
+    <w:lvl w:ilvl="5" w:tentative="1">
+      <w:start w:val="1"/>
+      <w:numFmt w:val="bullet"/>
+      <w:lvlText w:val=""/>
+      <w:lvlJc w:val="left"/>
+      <w:pPr>
+        <w:tabs>
+          <w:tab w:val="num" w:pos="4320"/>
+        </w:tabs>
+        <w:ind w:left="4320" w:hanging="360"/>
+      </w:pPr>
+      <w:rPr>
+        <w:rFonts w:ascii="Wingdings" w:hAnsi="Wingdings" w:hint="default"/>
+        <w:sz w:val="20"/>
+      </w:rPr>
+    </w:lvl>
+    <w:lvl w:ilvl="6" w:tentative="1">
+      <w:start w:val="1"/>
+      <w:numFmt w:val="bullet"/>
+      <w:lvlText w:val=""/>
+      <w:lvlJc w:val="left"/>
+      <w:pPr>
+        <w:tabs>
+          <w:tab w:val="num" w:pos="5040"/>
+        </w:tabs>
+        <w:ind w:left="5040" w:hanging="360"/>
+      </w:pPr>
+      <w:rPr>
+        <w:rFonts w:ascii="Wingdings" w:hAnsi="Wingdings" w:hint="default"/>
+        <w:sz w:val="20"/>
+      </w:rPr>
+    </w:lvl>
+    <w:lvl w:ilvl="7" w:tentative="1">
+      <w:start w:val="1"/>
+      <w:numFmt w:val="bullet"/>
+      <w:lvlText w:val=""/>
+      <w:lvlJc w:val="left"/>
+      <w:pPr>
+        <w:tabs>
+          <w:tab w:val="num" w:pos="5760"/>
+        </w:tabs>
+        <w:ind w:left="5760" w:hanging="360"/>
+      </w:pPr>
+      <w:rPr>
+        <w:rFonts w:ascii="Wingdings" w:hAnsi="Wingdings" w:hint="default"/>
+        <w:sz w:val="20"/>
+      </w:rPr>
+    </w:lvl>
+    <w:lvl w:ilvl="8" w:tentative="1">
+      <w:start w:val="1"/>
+      <w:numFmt w:val="bullet"/>
+      <w:lvlText w:val=""/>
+      <w:lvlJc w:val="left"/>
+      <w:pPr>
+        <w:tabs>
+          <w:tab w:val="num" w:pos="6480"/>
+        </w:tabs>
+        <w:ind w:left="6480" w:hanging="360"/>
+      </w:pPr>
+      <w:rPr>
+        <w:rFonts w:ascii="Wingdings" w:hAnsi="Wingdings" w:hint="default"/>
+        <w:sz w:val="20"/>
+      </w:rPr>
+    </w:lvl>
+  </w:abstractNum>
+  <w:abstractNum w:abstractNumId="9" w15:restartNumberingAfterBreak="0">
+    <w:nsid w:val="5772771F"/>
+    <w:multiLevelType w:val="multilevel"/>
+    <w:tmpl w:val="7B3048F2"/>
+    <w:lvl w:ilvl="0">
+      <w:start w:val="1"/>
+      <w:numFmt w:val="bullet"/>
+      <w:lvlText w:val=""/>
+      <w:lvlJc w:val="left"/>
+      <w:pPr>
+        <w:tabs>
+          <w:tab w:val="num" w:pos="720"/>
+        </w:tabs>
+        <w:ind w:left="720" w:hanging="360"/>
+      </w:pPr>
+      <w:rPr>
+        <w:rFonts w:ascii="Symbol" w:hAnsi="Symbol" w:hint="default"/>
+        <w:sz w:val="20"/>
+      </w:rPr>
+    </w:lvl>
+    <w:lvl w:ilvl="1" w:tentative="1">
+      <w:start w:val="1"/>
+      <w:numFmt w:val="bullet"/>
+      <w:lvlText w:val="o"/>
+      <w:lvlJc w:val="left"/>
+      <w:pPr>
+        <w:tabs>
+          <w:tab w:val="num" w:pos="1440"/>
+        </w:tabs>
+        <w:ind w:left="1440" w:hanging="360"/>
+      </w:pPr>
+      <w:rPr>
+        <w:rFonts w:ascii="Courier New" w:hAnsi="Courier New" w:hint="default"/>
+        <w:sz w:val="20"/>
+      </w:rPr>
+    </w:lvl>
+    <w:lvl w:ilvl="2" w:tentative="1">
+      <w:start w:val="1"/>
+      <w:numFmt w:val="bullet"/>
+      <w:lvlText w:val=""/>
+      <w:lvlJc w:val="left"/>
+      <w:pPr>
+        <w:tabs>
+          <w:tab w:val="num" w:pos="2160"/>
+        </w:tabs>
+        <w:ind w:left="2160" w:hanging="360"/>
+      </w:pPr>
+      <w:rPr>
+        <w:rFonts w:ascii="Wingdings" w:hAnsi="Wingdings" w:hint="default"/>
+        <w:sz w:val="20"/>
+      </w:rPr>
+    </w:lvl>
+    <w:lvl w:ilvl="3" w:tentative="1">
+      <w:start w:val="1"/>
+      <w:numFmt w:val="bullet"/>
+      <w:lvlText w:val=""/>
+      <w:lvlJc w:val="left"/>
+      <w:pPr>
+        <w:tabs>
+          <w:tab w:val="num" w:pos="2880"/>
+        </w:tabs>
+        <w:ind w:left="2880" w:hanging="360"/>
+      </w:pPr>
+      <w:rPr>
+        <w:rFonts w:ascii="Wingdings" w:hAnsi="Wingdings" w:hint="default"/>
+        <w:sz w:val="20"/>
+      </w:rPr>
+    </w:lvl>
+    <w:lvl w:ilvl="4" w:tentative="1">
+      <w:start w:val="1"/>
+      <w:numFmt w:val="bullet"/>
+      <w:lvlText w:val=""/>
+      <w:lvlJc w:val="left"/>
+      <w:pPr>
+        <w:tabs>
+          <w:tab w:val="num" w:pos="3600"/>
+        </w:tabs>
+        <w:ind w:left="3600" w:hanging="360"/>
+      </w:pPr>
+      <w:rPr>
+        <w:rFonts w:ascii="Wingdings" w:hAnsi="Wingdings" w:hint="default"/>
+        <w:sz w:val="20"/>
+      </w:rPr>
+    </w:lvl>
+    <w:lvl w:ilvl="5" w:tentative="1">
+      <w:start w:val="1"/>
+      <w:numFmt w:val="bullet"/>
+      <w:lvlText w:val=""/>
+      <w:lvlJc w:val="left"/>
+      <w:pPr>
+        <w:tabs>
+          <w:tab w:val="num" w:pos="4320"/>
+        </w:tabs>
+        <w:ind w:left="4320" w:hanging="360"/>
+      </w:pPr>
+      <w:rPr>
+        <w:rFonts w:ascii="Wingdings" w:hAnsi="Wingdings" w:hint="default"/>
+        <w:sz w:val="20"/>
+      </w:rPr>
+    </w:lvl>
+    <w:lvl w:ilvl="6" w:tentative="1">
+      <w:start w:val="1"/>
+      <w:numFmt w:val="bullet"/>
+      <w:lvlText w:val=""/>
+      <w:lvlJc w:val="left"/>
+      <w:pPr>
+        <w:tabs>
+          <w:tab w:val="num" w:pos="5040"/>
+        </w:tabs>
+        <w:ind w:left="5040" w:hanging="360"/>
+      </w:pPr>
+      <w:rPr>
+        <w:rFonts w:ascii="Wingdings" w:hAnsi="Wingdings" w:hint="default"/>
+        <w:sz w:val="20"/>
+      </w:rPr>
+    </w:lvl>
+    <w:lvl w:ilvl="7" w:tentative="1">
+      <w:start w:val="1"/>
+      <w:numFmt w:val="bullet"/>
+      <w:lvlText w:val=""/>
+      <w:lvlJc w:val="left"/>
+      <w:pPr>
+        <w:tabs>
+          <w:tab w:val="num" w:pos="5760"/>
+        </w:tabs>
+        <w:ind w:left="5760" w:hanging="360"/>
+      </w:pPr>
+      <w:rPr>
+        <w:rFonts w:ascii="Wingdings" w:hAnsi="Wingdings" w:hint="default"/>
+        <w:sz w:val="20"/>
+      </w:rPr>
+    </w:lvl>
+    <w:lvl w:ilvl="8" w:tentative="1">
+      <w:start w:val="1"/>
+      <w:numFmt w:val="bullet"/>
+      <w:lvlText w:val=""/>
+      <w:lvlJc w:val="left"/>
+      <w:pPr>
+        <w:tabs>
+          <w:tab w:val="num" w:pos="6480"/>
+        </w:tabs>
+        <w:ind w:left="6480" w:hanging="360"/>
+      </w:pPr>
+      <w:rPr>
+        <w:rFonts w:ascii="Wingdings" w:hAnsi="Wingdings" w:hint="default"/>
+        <w:sz w:val="20"/>
+      </w:rPr>
+    </w:lvl>
+  </w:abstractNum>
+  <w:abstractNum w:abstractNumId="10" w15:restartNumberingAfterBreak="0">
     <w:nsid w:val="5BFA5093"/>
     <w:multiLevelType w:val="multilevel"/>
     <w:tmpl w:val="9B50F7D8"/>
@@ -1196,7 +2671,7 @@
       </w:rPr>
     </w:lvl>
   </w:abstractNum>
-  <w:abstractNum w:abstractNumId="5" w15:restartNumberingAfterBreak="0">
+  <w:abstractNum w:abstractNumId="11" w15:restartNumberingAfterBreak="0">
     <w:nsid w:val="63BA2725"/>
     <w:multiLevelType w:val="multilevel"/>
     <w:tmpl w:val="D692617A"/>
@@ -1345,7 +2820,7 @@
       </w:rPr>
     </w:lvl>
   </w:abstractNum>
-  <w:abstractNum w:abstractNumId="6" w15:restartNumberingAfterBreak="0">
+  <w:abstractNum w:abstractNumId="12" w15:restartNumberingAfterBreak="0">
     <w:nsid w:val="66D12E23"/>
     <w:multiLevelType w:val="multilevel"/>
     <w:tmpl w:val="63867938"/>
@@ -1495,24 +2970,42 @@
     </w:lvl>
   </w:abstractNum>
   <w:num w:numId="1" w16cid:durableId="283081908">
+    <w:abstractNumId w:val="11"/>
+  </w:num>
+  <w:num w:numId="2" w16cid:durableId="1623807586">
+    <w:abstractNumId w:val="12"/>
+  </w:num>
+  <w:num w:numId="3" w16cid:durableId="1850097044">
+    <w:abstractNumId w:val="4"/>
+  </w:num>
+  <w:num w:numId="4" w16cid:durableId="1799495088">
+    <w:abstractNumId w:val="10"/>
+  </w:num>
+  <w:num w:numId="5" w16cid:durableId="1661881359">
+    <w:abstractNumId w:val="3"/>
+  </w:num>
+  <w:num w:numId="6" w16cid:durableId="1919636629">
+    <w:abstractNumId w:val="2"/>
+  </w:num>
+  <w:num w:numId="7" w16cid:durableId="611399317">
+    <w:abstractNumId w:val="1"/>
+  </w:num>
+  <w:num w:numId="8" w16cid:durableId="4401059">
+    <w:abstractNumId w:val="6"/>
+  </w:num>
+  <w:num w:numId="9" w16cid:durableId="1103916414">
+    <w:abstractNumId w:val="7"/>
+  </w:num>
+  <w:num w:numId="10" w16cid:durableId="1406993432">
+    <w:abstractNumId w:val="8"/>
+  </w:num>
+  <w:num w:numId="11" w16cid:durableId="169371940">
     <w:abstractNumId w:val="5"/>
   </w:num>
-  <w:num w:numId="2" w16cid:durableId="1623807586">
-    <w:abstractNumId w:val="6"/>
+  <w:num w:numId="12" w16cid:durableId="2108967268">
+    <w:abstractNumId w:val="9"/>
   </w:num>
-  <w:num w:numId="3" w16cid:durableId="1850097044">
-    <w:abstractNumId w:val="3"/>
-  </w:num>
-  <w:num w:numId="4" w16cid:durableId="1799495088">
-    <w:abstractNumId w:val="4"/>
-  </w:num>
-  <w:num w:numId="5" w16cid:durableId="1661881359">
-    <w:abstractNumId w:val="2"/>
-  </w:num>
-  <w:num w:numId="6" w16cid:durableId="1919636629">
-    <w:abstractNumId w:val="1"/>
-  </w:num>
-  <w:num w:numId="7" w16cid:durableId="611399317">
+  <w:num w:numId="13" w16cid:durableId="1475483565">
     <w:abstractNumId w:val="0"/>
   </w:num>
 </w:numbering>
@@ -2434,6 +3927,50 @@
       <w:spacing w:val="5"/>
     </w:rPr>
   </w:style>
+  <w:style w:type="paragraph" w:styleId="Header">
+    <w:name w:val="header"/>
+    <w:basedOn w:val="Normal"/>
+    <w:link w:val="HeaderChar"/>
+    <w:uiPriority w:val="99"/>
+    <w:unhideWhenUsed/>
+    <w:rsid w:val="0047783E"/>
+    <w:pPr>
+      <w:tabs>
+        <w:tab w:val="center" w:pos="4513"/>
+        <w:tab w:val="right" w:pos="9026"/>
+      </w:tabs>
+      <w:spacing w:after="0" w:line="240" w:lineRule="auto"/>
+    </w:pPr>
+  </w:style>
+  <w:style w:type="character" w:customStyle="1" w:styleId="HeaderChar">
+    <w:name w:val="Header Char"/>
+    <w:basedOn w:val="DefaultParagraphFont"/>
+    <w:link w:val="Header"/>
+    <w:uiPriority w:val="99"/>
+    <w:rsid w:val="0047783E"/>
+  </w:style>
+  <w:style w:type="paragraph" w:styleId="Footer">
+    <w:name w:val="footer"/>
+    <w:basedOn w:val="Normal"/>
+    <w:link w:val="FooterChar"/>
+    <w:uiPriority w:val="99"/>
+    <w:unhideWhenUsed/>
+    <w:rsid w:val="0047783E"/>
+    <w:pPr>
+      <w:tabs>
+        <w:tab w:val="center" w:pos="4513"/>
+        <w:tab w:val="right" w:pos="9026"/>
+      </w:tabs>
+      <w:spacing w:after="0" w:line="240" w:lineRule="auto"/>
+    </w:pPr>
+  </w:style>
+  <w:style w:type="character" w:customStyle="1" w:styleId="FooterChar">
+    <w:name w:val="Footer Char"/>
+    <w:basedOn w:val="DefaultParagraphFont"/>
+    <w:link w:val="Footer"/>
+    <w:uiPriority w:val="99"/>
+    <w:rsid w:val="0047783E"/>
+  </w:style>
 </w:styles>
 </file>
 

</xml_diff>